<commit_message>
Technical Assessment --> Technical Lead SuraTech
</commit_message>
<xml_diff>
--- a/Technical_Assesstment.docx
+++ b/Technical_Assesstment.docx
@@ -4,14 +4,17 @@
   <w:body>
     <w:p>
       <w:pPr>
-        <w:rPr>
-          <w:b/>
-          <w:bCs/>
-          <w:lang w:val="en-US"/>
-        </w:rPr>
-      </w:pPr>
-      <w:r>
-        <w:rPr>
+        <w:jc w:val="both"/>
+        <w:rPr>
+          <w:rFonts w:ascii="Arial" w:hAnsi="Arial" w:cs="Arial"/>
+          <w:b/>
+          <w:bCs/>
+          <w:lang w:val="en-US"/>
+        </w:rPr>
+      </w:pPr>
+      <w:r>
+        <w:rPr>
+          <w:rFonts w:ascii="Arial" w:hAnsi="Arial" w:cs="Arial"/>
           <w:b/>
           <w:bCs/>
           <w:lang w:val="en-US"/>
@@ -20,23 +23,38 @@
       </w:r>
       <w:r>
         <w:rPr>
-          <w:b/>
-          <w:bCs/>
-          <w:lang w:val="en-US"/>
-        </w:rPr>
-        <w:t xml:space="preserve">echnical Assessment </w:t>
-      </w:r>
-    </w:p>
-    <w:p>
-      <w:pPr>
-        <w:rPr>
-          <w:b/>
-          <w:bCs/>
-          <w:lang w:val="en-US"/>
-        </w:rPr>
-      </w:pPr>
-      <w:r>
-        <w:rPr>
+          <w:rFonts w:ascii="Arial" w:hAnsi="Arial" w:cs="Arial"/>
+          <w:b/>
+          <w:bCs/>
+          <w:lang w:val="en-US"/>
+        </w:rPr>
+        <w:t xml:space="preserve">echnical assessment for the role of tech lead </w:t>
+      </w:r>
+      <w:proofErr w:type="spellStart"/>
+      <w:r>
+        <w:rPr>
+          <w:rFonts w:ascii="Arial" w:hAnsi="Arial" w:cs="Arial"/>
+          <w:b/>
+          <w:bCs/>
+          <w:lang w:val="en-US"/>
+        </w:rPr>
+        <w:t>SuraTech</w:t>
+      </w:r>
+      <w:proofErr w:type="spellEnd"/>
+    </w:p>
+    <w:p>
+      <w:pPr>
+        <w:jc w:val="both"/>
+        <w:rPr>
+          <w:rFonts w:ascii="Arial" w:hAnsi="Arial" w:cs="Arial"/>
+          <w:b/>
+          <w:bCs/>
+          <w:lang w:val="en-US"/>
+        </w:rPr>
+      </w:pPr>
+      <w:r>
+        <w:rPr>
+          <w:rFonts w:ascii="Arial" w:hAnsi="Arial" w:cs="Arial"/>
           <w:b/>
           <w:bCs/>
           <w:lang w:val="en-US"/>
@@ -46,32 +64,39 @@
     </w:p>
     <w:p>
       <w:pPr>
-        <w:rPr>
-          <w:b/>
-          <w:bCs/>
-          <w:lang w:val="en-US"/>
-        </w:rPr>
-      </w:pPr>
-    </w:p>
-    <w:p>
-      <w:pPr>
-        <w:rPr>
-          <w:b/>
-          <w:bCs/>
-          <w:lang w:val="en-US"/>
-        </w:rPr>
-      </w:pPr>
-    </w:p>
-    <w:p>
-      <w:pPr>
-        <w:rPr>
-          <w:b/>
-          <w:bCs/>
-          <w:lang w:val="en-US"/>
-        </w:rPr>
-      </w:pPr>
-      <w:r>
-        <w:rPr>
+        <w:jc w:val="both"/>
+        <w:rPr>
+          <w:rFonts w:ascii="Arial" w:hAnsi="Arial" w:cs="Arial"/>
+          <w:b/>
+          <w:bCs/>
+          <w:lang w:val="en-US"/>
+        </w:rPr>
+      </w:pPr>
+    </w:p>
+    <w:p>
+      <w:pPr>
+        <w:jc w:val="both"/>
+        <w:rPr>
+          <w:rFonts w:ascii="Arial" w:hAnsi="Arial" w:cs="Arial"/>
+          <w:b/>
+          <w:bCs/>
+          <w:lang w:val="en-US"/>
+        </w:rPr>
+      </w:pPr>
+    </w:p>
+    <w:p>
+      <w:pPr>
+        <w:jc w:val="both"/>
+        <w:rPr>
+          <w:rFonts w:ascii="Arial" w:hAnsi="Arial" w:cs="Arial"/>
+          <w:b/>
+          <w:bCs/>
+          <w:lang w:val="en-US"/>
+        </w:rPr>
+      </w:pPr>
+      <w:r>
+        <w:rPr>
+          <w:rFonts w:ascii="Arial" w:hAnsi="Arial" w:cs="Arial"/>
           <w:b/>
           <w:bCs/>
           <w:lang w:val="en-US"/>
@@ -81,14 +106,17 @@
     </w:p>
     <w:p>
       <w:pPr>
-        <w:rPr>
-          <w:b/>
-          <w:bCs/>
-          <w:lang w:val="en-US"/>
-        </w:rPr>
-      </w:pPr>
-      <w:r>
-        <w:rPr>
+        <w:jc w:val="both"/>
+        <w:rPr>
+          <w:rFonts w:ascii="Arial" w:hAnsi="Arial" w:cs="Arial"/>
+          <w:b/>
+          <w:bCs/>
+          <w:lang w:val="en-US"/>
+        </w:rPr>
+      </w:pPr>
+      <w:r>
+        <w:rPr>
+          <w:rFonts w:ascii="Arial" w:hAnsi="Arial" w:cs="Arial"/>
           <w:b/>
           <w:bCs/>
           <w:lang w:val="en-US"/>
@@ -98,18 +126,22 @@
     </w:p>
     <w:p>
       <w:pPr>
-        <w:rPr>
-          <w:lang w:val="en-US"/>
-        </w:rPr>
-      </w:pPr>
-      <w:r>
-        <w:rPr>
+        <w:jc w:val="both"/>
+        <w:rPr>
+          <w:rFonts w:ascii="Arial" w:hAnsi="Arial" w:cs="Arial"/>
+          <w:lang w:val="en-US"/>
+        </w:rPr>
+      </w:pPr>
+      <w:r>
+        <w:rPr>
+          <w:rFonts w:ascii="Arial" w:hAnsi="Arial" w:cs="Arial"/>
           <w:lang w:val="en-US"/>
         </w:rPr>
         <w:t>To support a multi-country Digital Direct Channel, the architecture must follow a </w:t>
       </w:r>
       <w:r>
         <w:rPr>
+          <w:rFonts w:ascii="Arial" w:hAnsi="Arial" w:cs="Arial"/>
           <w:b/>
           <w:bCs/>
           <w:lang w:val="en-US"/>
@@ -118,34 +150,26 @@
       </w:r>
       <w:r>
         <w:rPr>
+          <w:rFonts w:ascii="Arial" w:hAnsi="Arial" w:cs="Arial"/>
           <w:lang w:val="en-US"/>
         </w:rPr>
         <w:t> approach. The design relies on an Active-Active multi-region footprint to ensure low latency for local users and seamless failover.</w:t>
       </w:r>
     </w:p>
     <w:p>
-      <w:r>
-        <w:rPr>
-          <w:b/>
-          <w:bCs/>
-        </w:rPr>
-        <w:t xml:space="preserve">Core </w:t>
-      </w:r>
-      <w:proofErr w:type="spellStart"/>
-      <w:r>
-        <w:rPr>
-          <w:b/>
-          <w:bCs/>
-        </w:rPr>
-        <w:t>Architectural</w:t>
-      </w:r>
-      <w:proofErr w:type="spellEnd"/>
-      <w:r>
-        <w:rPr>
-          <w:b/>
-          <w:bCs/>
-        </w:rPr>
-        <w:t xml:space="preserve"> Pillars:</w:t>
+      <w:pPr>
+        <w:jc w:val="both"/>
+        <w:rPr>
+          <w:rFonts w:ascii="Arial" w:hAnsi="Arial" w:cs="Arial"/>
+        </w:rPr>
+      </w:pPr>
+      <w:r>
+        <w:rPr>
+          <w:rFonts w:ascii="Arial" w:hAnsi="Arial" w:cs="Arial"/>
+          <w:b/>
+          <w:bCs/>
+        </w:rPr>
+        <w:t>Core Architectural Pillars:</w:t>
       </w:r>
     </w:p>
     <w:p>
@@ -154,12 +178,15 @@
           <w:ilvl w:val="0"/>
           <w:numId w:val="5"/>
         </w:numPr>
-        <w:rPr>
-          <w:lang w:val="en-US"/>
-        </w:rPr>
-      </w:pPr>
-      <w:r>
-        <w:rPr>
+        <w:jc w:val="both"/>
+        <w:rPr>
+          <w:rFonts w:ascii="Arial" w:hAnsi="Arial" w:cs="Arial"/>
+          <w:lang w:val="en-US"/>
+        </w:rPr>
+      </w:pPr>
+      <w:r>
+        <w:rPr>
+          <w:rFonts w:ascii="Arial" w:hAnsi="Arial" w:cs="Arial"/>
           <w:b/>
           <w:bCs/>
           <w:lang w:val="en-US"/>
@@ -168,6 +195,7 @@
       </w:r>
       <w:r>
         <w:rPr>
+          <w:rFonts w:ascii="Arial" w:hAnsi="Arial" w:cs="Arial"/>
           <w:lang w:val="en-US"/>
         </w:rPr>
         <w:t> Deployments are distributed across at least two geographical regions (e.g., North America and Europe) in an Active-Active configuration. Global DNS and Content Delivery Networks (CDN) geo-route user traffic to the closest healthy region. If a region degrades, traffic is automatically routed to the surviving region.</w:t>
@@ -179,9 +207,14 @@
           <w:ilvl w:val="0"/>
           <w:numId w:val="5"/>
         </w:numPr>
-      </w:pPr>
-      <w:r>
-        <w:rPr>
+        <w:jc w:val="both"/>
+        <w:rPr>
+          <w:rFonts w:ascii="Arial" w:hAnsi="Arial" w:cs="Arial"/>
+        </w:rPr>
+      </w:pPr>
+      <w:r>
+        <w:rPr>
+          <w:rFonts w:ascii="Arial" w:hAnsi="Arial" w:cs="Arial"/>
           <w:b/>
           <w:bCs/>
           <w:lang w:val="en-US"/>
@@ -190,40 +223,65 @@
       </w:r>
       <w:r>
         <w:rPr>
+          <w:rFonts w:ascii="Arial" w:hAnsi="Arial" w:cs="Arial"/>
           <w:lang w:val="en-US"/>
         </w:rPr>
         <w:t xml:space="preserve"> Workloads run on managed Kubernetes clusters (e.g., AKS, EKS) utilizing Horizontal Pod Autoscaling (HPA) and Event-Driven Autoscaling (KEDA) based on CPU, memory, and queue depths. </w:t>
       </w:r>
       <w:proofErr w:type="spellStart"/>
       <w:r>
+        <w:rPr>
+          <w:rFonts w:ascii="Arial" w:hAnsi="Arial" w:cs="Arial"/>
+        </w:rPr>
         <w:t>Databases</w:t>
       </w:r>
       <w:proofErr w:type="spellEnd"/>
       <w:r>
+        <w:rPr>
+          <w:rFonts w:ascii="Arial" w:hAnsi="Arial" w:cs="Arial"/>
+        </w:rPr>
         <w:t xml:space="preserve"> are geo-</w:t>
       </w:r>
       <w:proofErr w:type="spellStart"/>
       <w:r>
+        <w:rPr>
+          <w:rFonts w:ascii="Arial" w:hAnsi="Arial" w:cs="Arial"/>
+        </w:rPr>
         <w:t>replicated</w:t>
       </w:r>
       <w:proofErr w:type="spellEnd"/>
       <w:r>
+        <w:rPr>
+          <w:rFonts w:ascii="Arial" w:hAnsi="Arial" w:cs="Arial"/>
+        </w:rPr>
         <w:t xml:space="preserve"> and </w:t>
       </w:r>
       <w:proofErr w:type="spellStart"/>
       <w:r>
+        <w:rPr>
+          <w:rFonts w:ascii="Arial" w:hAnsi="Arial" w:cs="Arial"/>
+        </w:rPr>
         <w:t>scaled</w:t>
       </w:r>
       <w:proofErr w:type="spellEnd"/>
       <w:r>
+        <w:rPr>
+          <w:rFonts w:ascii="Arial" w:hAnsi="Arial" w:cs="Arial"/>
+        </w:rPr>
         <w:t xml:space="preserve"> </w:t>
       </w:r>
       <w:proofErr w:type="spellStart"/>
       <w:r>
+        <w:rPr>
+          <w:rFonts w:ascii="Arial" w:hAnsi="Arial" w:cs="Arial"/>
+        </w:rPr>
         <w:t>horizontally</w:t>
       </w:r>
       <w:proofErr w:type="spellEnd"/>
       <w:r>
+        <w:rPr>
+          <w:rFonts w:ascii="Arial" w:hAnsi="Arial" w:cs="Arial"/>
+        </w:rPr>
         <w:t>.</w:t>
       </w:r>
     </w:p>
@@ -233,12 +291,15 @@
           <w:ilvl w:val="0"/>
           <w:numId w:val="5"/>
         </w:numPr>
-        <w:rPr>
-          <w:lang w:val="en-US"/>
-        </w:rPr>
-      </w:pPr>
-      <w:r>
-        <w:rPr>
+        <w:jc w:val="both"/>
+        <w:rPr>
+          <w:rFonts w:ascii="Arial" w:hAnsi="Arial" w:cs="Arial"/>
+          <w:lang w:val="en-US"/>
+        </w:rPr>
+      </w:pPr>
+      <w:r>
+        <w:rPr>
+          <w:rFonts w:ascii="Arial" w:hAnsi="Arial" w:cs="Arial"/>
           <w:b/>
           <w:bCs/>
           <w:lang w:val="en-US"/>
@@ -247,6 +308,7 @@
       </w:r>
       <w:r>
         <w:rPr>
+          <w:rFonts w:ascii="Arial" w:hAnsi="Arial" w:cs="Arial"/>
           <w:lang w:val="en-US"/>
         </w:rPr>
         <w:t> The application tier is decoupled from underlying legacy systems using Event-Driven Architecture (EDA). If backend fulfillment or ERP systems go down, the Direct Channel continues to take requests (e.g., orders/bookings) and queues them for eventual processing.</w:t>
@@ -258,12 +320,15 @@
           <w:ilvl w:val="0"/>
           <w:numId w:val="5"/>
         </w:numPr>
-        <w:rPr>
-          <w:lang w:val="en-US"/>
-        </w:rPr>
-      </w:pPr>
-      <w:r>
-        <w:rPr>
+        <w:jc w:val="both"/>
+        <w:rPr>
+          <w:rFonts w:ascii="Arial" w:hAnsi="Arial" w:cs="Arial"/>
+          <w:lang w:val="en-US"/>
+        </w:rPr>
+      </w:pPr>
+      <w:r>
+        <w:rPr>
+          <w:rFonts w:ascii="Arial" w:hAnsi="Arial" w:cs="Arial"/>
           <w:b/>
           <w:bCs/>
           <w:lang w:val="en-US"/>
@@ -272,6 +337,7 @@
       </w:r>
       <w:r>
         <w:rPr>
+          <w:rFonts w:ascii="Arial" w:hAnsi="Arial" w:cs="Arial"/>
           <w:lang w:val="en-US"/>
         </w:rPr>
         <w:t xml:space="preserve"> A centralized observability plane aggregates Metrics, Logs, and Traces utilizing the </w:t>
@@ -279,6 +345,7 @@
       <w:proofErr w:type="spellStart"/>
       <w:r>
         <w:rPr>
+          <w:rFonts w:ascii="Arial" w:hAnsi="Arial" w:cs="Arial"/>
           <w:lang w:val="en-US"/>
         </w:rPr>
         <w:t>OpenTelemetry</w:t>
@@ -286,6 +353,7 @@
       <w:proofErr w:type="spellEnd"/>
       <w:r>
         <w:rPr>
+          <w:rFonts w:ascii="Arial" w:hAnsi="Arial" w:cs="Arial"/>
           <w:lang w:val="en-US"/>
         </w:rPr>
         <w:t xml:space="preserve"> standard. Distributed tracing correlates multi-country interactions, ensuring end-to-end visibility across microservices and external dependencies.</w:t>
@@ -293,29 +361,72 @@
     </w:p>
     <w:p>
       <w:pPr>
-        <w:rPr>
-          <w:b/>
-          <w:bCs/>
-          <w:lang w:val="en-US"/>
-        </w:rPr>
-      </w:pPr>
-      <w:r>
-        <w:rPr>
-          <w:b/>
-          <w:bCs/>
-          <w:lang w:val="en-US"/>
-        </w:rPr>
+        <w:jc w:val="both"/>
+        <w:rPr>
+          <w:rFonts w:ascii="Arial" w:hAnsi="Arial" w:cs="Arial"/>
+          <w:lang w:val="en-US"/>
+        </w:rPr>
+      </w:pPr>
+    </w:p>
+    <w:p>
+      <w:pPr>
+        <w:jc w:val="both"/>
+        <w:rPr>
+          <w:rFonts w:ascii="Arial" w:hAnsi="Arial" w:cs="Arial"/>
+          <w:lang w:val="en-US"/>
+        </w:rPr>
+      </w:pPr>
+    </w:p>
+    <w:p>
+      <w:pPr>
+        <w:jc w:val="both"/>
+        <w:rPr>
+          <w:rFonts w:ascii="Arial" w:hAnsi="Arial" w:cs="Arial"/>
+          <w:lang w:val="en-US"/>
+        </w:rPr>
+      </w:pPr>
+    </w:p>
+    <w:p>
+      <w:pPr>
+        <w:jc w:val="both"/>
+        <w:rPr>
+          <w:rFonts w:ascii="Arial" w:hAnsi="Arial" w:cs="Arial"/>
+          <w:lang w:val="en-US"/>
+        </w:rPr>
+      </w:pPr>
+    </w:p>
+    <w:p>
+      <w:pPr>
+        <w:jc w:val="both"/>
+        <w:rPr>
+          <w:rFonts w:ascii="Arial" w:hAnsi="Arial" w:cs="Arial"/>
+          <w:b/>
+          <w:bCs/>
+          <w:lang w:val="en-US"/>
+        </w:rPr>
+      </w:pPr>
+      <w:r>
+        <w:rPr>
+          <w:rFonts w:ascii="Arial" w:hAnsi="Arial" w:cs="Arial"/>
+          <w:b/>
+          <w:bCs/>
+          <w:lang w:val="en-US"/>
+        </w:rPr>
+        <w:lastRenderedPageBreak/>
         <w:t>2. Integration &amp; Resilience Patterns</w:t>
       </w:r>
     </w:p>
     <w:p>
       <w:pPr>
-        <w:rPr>
-          <w:lang w:val="en-US"/>
-        </w:rPr>
-      </w:pPr>
-      <w:r>
-        <w:rPr>
+        <w:jc w:val="both"/>
+        <w:rPr>
+          <w:rFonts w:ascii="Arial" w:hAnsi="Arial" w:cs="Arial"/>
+          <w:lang w:val="en-US"/>
+        </w:rPr>
+      </w:pPr>
+      <w:r>
+        <w:rPr>
+          <w:rFonts w:ascii="Arial" w:hAnsi="Arial" w:cs="Arial"/>
           <w:lang w:val="en-US"/>
         </w:rPr>
         <w:t>To guarantee system stability under heavy load and unreliable network conditions, the following patterns are enforced across the integration layer:</w:t>
@@ -327,21 +438,24 @@
           <w:ilvl w:val="0"/>
           <w:numId w:val="6"/>
         </w:numPr>
-        <w:rPr>
-          <w:lang w:val="en-US"/>
-        </w:rPr>
-      </w:pPr>
-      <w:r>
-        <w:rPr>
-          <w:b/>
-          <w:bCs/>
-          <w:lang w:val="en-US"/>
-        </w:rPr>
-        <w:lastRenderedPageBreak/>
+        <w:jc w:val="both"/>
+        <w:rPr>
+          <w:rFonts w:ascii="Arial" w:hAnsi="Arial" w:cs="Arial"/>
+          <w:lang w:val="en-US"/>
+        </w:rPr>
+      </w:pPr>
+      <w:r>
+        <w:rPr>
+          <w:rFonts w:ascii="Arial" w:hAnsi="Arial" w:cs="Arial"/>
+          <w:b/>
+          <w:bCs/>
+          <w:lang w:val="en-US"/>
+        </w:rPr>
         <w:t>Retries (with Exponential Backoff &amp; Jitter):</w:t>
       </w:r>
       <w:r>
         <w:rPr>
+          <w:rFonts w:ascii="Arial" w:hAnsi="Arial" w:cs="Arial"/>
           <w:lang w:val="en-US"/>
         </w:rPr>
         <w:t xml:space="preserve"> Transient network errors are handled via automated retries configured at the Service Mesh level (e.g., Istio or </w:t>
@@ -349,6 +463,7 @@
       <w:proofErr w:type="spellStart"/>
       <w:r>
         <w:rPr>
+          <w:rFonts w:ascii="Arial" w:hAnsi="Arial" w:cs="Arial"/>
           <w:lang w:val="en-US"/>
         </w:rPr>
         <w:t>Linkerd</w:t>
@@ -356,6 +471,7 @@
       <w:proofErr w:type="spellEnd"/>
       <w:r>
         <w:rPr>
+          <w:rFonts w:ascii="Arial" w:hAnsi="Arial" w:cs="Arial"/>
           <w:lang w:val="en-US"/>
         </w:rPr>
         <w:t>). Jitter prevents "thundering herd" scenarios where multiple instances retry simultaneously.</w:t>
@@ -367,12 +483,15 @@
           <w:ilvl w:val="0"/>
           <w:numId w:val="6"/>
         </w:numPr>
-        <w:rPr>
-          <w:lang w:val="en-US"/>
-        </w:rPr>
-      </w:pPr>
-      <w:r>
-        <w:rPr>
+        <w:jc w:val="both"/>
+        <w:rPr>
+          <w:rFonts w:ascii="Arial" w:hAnsi="Arial" w:cs="Arial"/>
+          <w:lang w:val="en-US"/>
+        </w:rPr>
+      </w:pPr>
+      <w:r>
+        <w:rPr>
+          <w:rFonts w:ascii="Arial" w:hAnsi="Arial" w:cs="Arial"/>
           <w:b/>
           <w:bCs/>
           <w:lang w:val="en-US"/>
@@ -381,6 +500,7 @@
       </w:r>
       <w:r>
         <w:rPr>
+          <w:rFonts w:ascii="Arial" w:hAnsi="Arial" w:cs="Arial"/>
           <w:lang w:val="en-US"/>
         </w:rPr>
         <w:t> Implemented at the API Gateway and Service Mesh levels. If a downstream service (like a legacy CRM) experiences sustained failures or latency, the circuit trips to prevent cascading resource exhaustion, returning a cached response or a graceful error message.</w:t>
@@ -392,12 +512,15 @@
           <w:ilvl w:val="0"/>
           <w:numId w:val="6"/>
         </w:numPr>
-        <w:rPr>
-          <w:lang w:val="en-US"/>
-        </w:rPr>
-      </w:pPr>
-      <w:r>
-        <w:rPr>
+        <w:jc w:val="both"/>
+        <w:rPr>
+          <w:rFonts w:ascii="Arial" w:hAnsi="Arial" w:cs="Arial"/>
+          <w:lang w:val="en-US"/>
+        </w:rPr>
+      </w:pPr>
+      <w:r>
+        <w:rPr>
+          <w:rFonts w:ascii="Arial" w:hAnsi="Arial" w:cs="Arial"/>
           <w:b/>
           <w:bCs/>
           <w:lang w:val="en-US"/>
@@ -406,6 +529,7 @@
       </w:r>
       <w:r>
         <w:rPr>
+          <w:rFonts w:ascii="Arial" w:hAnsi="Arial" w:cs="Arial"/>
           <w:lang w:val="en-US"/>
         </w:rPr>
         <w:t> Critical for multi-country transactions (e.g., payments, orders). Every state-mutating API call requires an Idempotency-Key in the header. The gateway/service verifies this key against a distributed cache (Redis) to guarantee that a network retry never results in duplicate transactions.</w:t>
@@ -417,12 +541,15 @@
           <w:ilvl w:val="0"/>
           <w:numId w:val="6"/>
         </w:numPr>
-        <w:rPr>
-          <w:lang w:val="en-US"/>
-        </w:rPr>
-      </w:pPr>
-      <w:r>
-        <w:rPr>
+        <w:jc w:val="both"/>
+        <w:rPr>
+          <w:rFonts w:ascii="Arial" w:hAnsi="Arial" w:cs="Arial"/>
+          <w:lang w:val="en-US"/>
+        </w:rPr>
+      </w:pPr>
+      <w:r>
+        <w:rPr>
+          <w:rFonts w:ascii="Arial" w:hAnsi="Arial" w:cs="Arial"/>
           <w:b/>
           <w:bCs/>
           <w:lang w:val="en-US"/>
@@ -431,6 +558,7 @@
       </w:r>
       <w:r>
         <w:rPr>
+          <w:rFonts w:ascii="Arial" w:hAnsi="Arial" w:cs="Arial"/>
           <w:lang w:val="en-US"/>
         </w:rPr>
         <w:t> Resource isolation is applied per service integration. Thread pools and memory limits are partitioned so that if a specific external API slows down, it only exhausts its dedicated connection pool, keeping the rest of the application responsive.</w:t>
@@ -442,12 +570,15 @@
           <w:ilvl w:val="0"/>
           <w:numId w:val="6"/>
         </w:numPr>
-        <w:rPr>
-          <w:lang w:val="en-US"/>
-        </w:rPr>
-      </w:pPr>
-      <w:r>
-        <w:rPr>
+        <w:jc w:val="both"/>
+        <w:rPr>
+          <w:rFonts w:ascii="Arial" w:hAnsi="Arial" w:cs="Arial"/>
+          <w:lang w:val="en-US"/>
+        </w:rPr>
+      </w:pPr>
+      <w:r>
+        <w:rPr>
+          <w:rFonts w:ascii="Arial" w:hAnsi="Arial" w:cs="Arial"/>
           <w:b/>
           <w:bCs/>
           <w:lang w:val="en-US"/>
@@ -456,6 +587,7 @@
       </w:r>
       <w:r>
         <w:rPr>
+          <w:rFonts w:ascii="Arial" w:hAnsi="Arial" w:cs="Arial"/>
           <w:lang w:val="en-US"/>
         </w:rPr>
         <w:t> Direct point-to-point synchronous calls are minimized. A distributed message broker (e.g., Kafka or Cloud Service Bus) is used for Publish-Subscribe flows. For example, once an order is placed, an </w:t>
@@ -463,6 +595,7 @@
       <w:proofErr w:type="spellStart"/>
       <w:r>
         <w:rPr>
+          <w:rFonts w:ascii="Arial" w:hAnsi="Arial" w:cs="Arial"/>
           <w:lang w:val="en-US"/>
         </w:rPr>
         <w:t>OrderCreated</w:t>
@@ -470,6 +603,7 @@
       <w:proofErr w:type="spellEnd"/>
       <w:r>
         <w:rPr>
+          <w:rFonts w:ascii="Arial" w:hAnsi="Arial" w:cs="Arial"/>
           <w:lang w:val="en-US"/>
         </w:rPr>
         <w:t> event is published, decoupling the frontend response from the heavy backend processing.</w:t>
@@ -481,10 +615,15 @@
           <w:ilvl w:val="0"/>
           <w:numId w:val="6"/>
         </w:numPr>
+        <w:jc w:val="both"/>
+        <w:rPr>
+          <w:rFonts w:ascii="Arial" w:hAnsi="Arial" w:cs="Arial"/>
+        </w:rPr>
       </w:pPr>
       <w:proofErr w:type="spellStart"/>
       <w:r>
         <w:rPr>
+          <w:rFonts w:ascii="Arial" w:hAnsi="Arial" w:cs="Arial"/>
           <w:b/>
           <w:bCs/>
         </w:rPr>
@@ -493,6 +632,7 @@
       <w:proofErr w:type="spellEnd"/>
       <w:r>
         <w:rPr>
+          <w:rFonts w:ascii="Arial" w:hAnsi="Arial" w:cs="Arial"/>
           <w:b/>
           <w:bCs/>
         </w:rPr>
@@ -501,6 +641,7 @@
       <w:proofErr w:type="spellStart"/>
       <w:r>
         <w:rPr>
+          <w:rFonts w:ascii="Arial" w:hAnsi="Arial" w:cs="Arial"/>
           <w:b/>
           <w:bCs/>
         </w:rPr>
@@ -509,6 +650,7 @@
       <w:proofErr w:type="spellEnd"/>
       <w:r>
         <w:rPr>
+          <w:rFonts w:ascii="Arial" w:hAnsi="Arial" w:cs="Arial"/>
           <w:b/>
           <w:bCs/>
         </w:rPr>
@@ -521,23 +663,18 @@
           <w:ilvl w:val="1"/>
           <w:numId w:val="6"/>
         </w:numPr>
-        <w:rPr>
-          <w:lang w:val="en-US"/>
-        </w:rPr>
-      </w:pPr>
-      <w:r>
-        <w:rPr>
-          <w:i/>
-          <w:iCs/>
-          <w:lang w:val="en-US"/>
-        </w:rPr>
-        <w:t>Edge Caching:</w:t>
-      </w:r>
-      <w:r>
-        <w:rPr>
-          <w:lang w:val="en-US"/>
-        </w:rPr>
-        <w:t> Static assets and localized configurations are cached at the global CDN level.</w:t>
+        <w:jc w:val="both"/>
+        <w:rPr>
+          <w:rFonts w:ascii="Arial" w:hAnsi="Arial" w:cs="Arial"/>
+          <w:lang w:val="en-US"/>
+        </w:rPr>
+      </w:pPr>
+      <w:r>
+        <w:rPr>
+          <w:rFonts w:ascii="Arial" w:hAnsi="Arial" w:cs="Arial"/>
+          <w:lang w:val="en-US"/>
+        </w:rPr>
+        <w:t>Edge Caching: Static assets and localized configurations are cached at the global CDN level.</w:t>
       </w:r>
     </w:p>
     <w:p>
@@ -546,43 +683,43 @@
           <w:ilvl w:val="1"/>
           <w:numId w:val="6"/>
         </w:numPr>
-        <w:rPr>
-          <w:lang w:val="en-US"/>
-        </w:rPr>
-      </w:pPr>
-      <w:r>
-        <w:rPr>
-          <w:i/>
-          <w:iCs/>
-          <w:lang w:val="en-US"/>
-        </w:rPr>
-        <w:t>Cache-Aside Pattern:</w:t>
-      </w:r>
-      <w:r>
-        <w:rPr>
-          <w:lang w:val="en-US"/>
-        </w:rPr>
-        <w:t> Distributed Redis caches read-heavy, slow-moving data (product catalogs, multi-country localization files) at the microservice level to reduce database queries.</w:t>
+        <w:jc w:val="both"/>
+        <w:rPr>
+          <w:rFonts w:ascii="Arial" w:hAnsi="Arial" w:cs="Arial"/>
+          <w:lang w:val="en-US"/>
+        </w:rPr>
+      </w:pPr>
+      <w:r>
+        <w:rPr>
+          <w:rFonts w:ascii="Arial" w:hAnsi="Arial" w:cs="Arial"/>
+          <w:lang w:val="en-US"/>
+        </w:rPr>
+        <w:t>Cache-Aside Pattern: Distributed Redis caches read-heavy, slow-moving data (product catalogs, multi-country localization files) at the microservice level to reduce database queries.</w:t>
       </w:r>
     </w:p>
     <w:p>
       <w:pPr>
         <w:ind w:left="720"/>
-        <w:rPr>
-          <w:lang w:val="en-US"/>
-        </w:rPr>
-      </w:pPr>
-    </w:p>
-    <w:p>
-      <w:pPr>
-        <w:rPr>
-          <w:b/>
-          <w:bCs/>
-          <w:lang w:val="en-US"/>
-        </w:rPr>
-      </w:pPr>
-      <w:r>
-        <w:rPr>
+        <w:jc w:val="both"/>
+        <w:rPr>
+          <w:rFonts w:ascii="Arial" w:hAnsi="Arial" w:cs="Arial"/>
+          <w:lang w:val="en-US"/>
+        </w:rPr>
+      </w:pPr>
+    </w:p>
+    <w:p>
+      <w:pPr>
+        <w:jc w:val="both"/>
+        <w:rPr>
+          <w:rFonts w:ascii="Arial" w:hAnsi="Arial" w:cs="Arial"/>
+          <w:b/>
+          <w:bCs/>
+          <w:lang w:val="en-US"/>
+        </w:rPr>
+      </w:pPr>
+      <w:r>
+        <w:rPr>
+          <w:rFonts w:ascii="Arial" w:hAnsi="Arial" w:cs="Arial"/>
           <w:b/>
           <w:bCs/>
           <w:lang w:val="en-US"/>
@@ -592,12 +729,15 @@
     </w:p>
     <w:p>
       <w:pPr>
-        <w:rPr>
-          <w:lang w:val="en-US"/>
-        </w:rPr>
-      </w:pPr>
-      <w:r>
-        <w:rPr>
+        <w:jc w:val="both"/>
+        <w:rPr>
+          <w:rFonts w:ascii="Arial" w:hAnsi="Arial" w:cs="Arial"/>
+          <w:lang w:val="en-US"/>
+        </w:rPr>
+      </w:pPr>
+      <w:r>
+        <w:rPr>
+          <w:rFonts w:ascii="Arial" w:hAnsi="Arial" w:cs="Arial"/>
           <w:lang w:val="en-US"/>
         </w:rPr>
         <w:t>This roadmap outlines the phased execution across three critical workstreams to modernize and harden the platform.</w:t>
@@ -605,51 +745,52 @@
     </w:p>
     <w:p>
       <w:pPr>
-        <w:rPr>
-          <w:lang w:val="en-US"/>
-        </w:rPr>
-      </w:pPr>
-    </w:p>
-    <w:p>
-      <w:pPr>
-        <w:rPr>
-          <w:lang w:val="en-US"/>
-        </w:rPr>
-      </w:pPr>
-    </w:p>
-    <w:p>
-      <w:pPr>
-        <w:jc w:val="center"/>
-        <w:rPr>
-          <w:lang w:val="en-US"/>
-        </w:rPr>
-      </w:pPr>
-      <w:r>
-        <w:rPr>
+        <w:jc w:val="both"/>
+        <w:rPr>
+          <w:rFonts w:ascii="Arial" w:hAnsi="Arial" w:cs="Arial"/>
+          <w:lang w:val="en-US"/>
+        </w:rPr>
+      </w:pPr>
+    </w:p>
+    <w:p>
+      <w:pPr>
+        <w:jc w:val="both"/>
+        <w:rPr>
+          <w:rFonts w:ascii="Arial" w:hAnsi="Arial" w:cs="Arial"/>
+          <w:lang w:val="en-US"/>
+        </w:rPr>
+      </w:pPr>
+      <w:r>
+        <w:rPr>
+          <w:rFonts w:ascii="Arial" w:hAnsi="Arial" w:cs="Arial"/>
           <w:lang w:val="en-US"/>
         </w:rPr>
         <w:t xml:space="preserve">Architecture </w:t>
       </w:r>
       <w:r>
         <w:rPr>
+          <w:rFonts w:ascii="Arial" w:hAnsi="Arial" w:cs="Arial"/>
           <w:lang w:val="en-US"/>
         </w:rPr>
         <w:t>diagram (</w:t>
       </w:r>
       <w:r>
         <w:rPr>
+          <w:rFonts w:ascii="Arial" w:hAnsi="Arial" w:cs="Arial"/>
           <w:lang w:val="en-US"/>
         </w:rPr>
         <w:t xml:space="preserve">source </w:t>
       </w:r>
       <w:r>
         <w:rPr>
+          <w:rFonts w:ascii="Arial" w:hAnsi="Arial" w:cs="Arial"/>
           <w:lang w:val="en-US"/>
         </w:rPr>
         <w:t>–</w:t>
       </w:r>
       <w:r>
         <w:rPr>
+          <w:rFonts w:ascii="Arial" w:hAnsi="Arial" w:cs="Arial"/>
           <w:lang w:val="en-US"/>
         </w:rPr>
         <w:t xml:space="preserve"> </w:t>
@@ -657,12 +798,14 @@
       <w:proofErr w:type="spellStart"/>
       <w:r>
         <w:rPr>
+          <w:rFonts w:ascii="Arial" w:hAnsi="Arial" w:cs="Arial"/>
           <w:lang w:val="en-US"/>
         </w:rPr>
         <w:t>archi</w:t>
       </w:r>
       <w:r>
         <w:rPr>
+          <w:rFonts w:ascii="Arial" w:hAnsi="Arial" w:cs="Arial"/>
           <w:lang w:val="en-US"/>
         </w:rPr>
         <w:t>tecture_diagram.mmd</w:t>
@@ -670,6 +813,7 @@
       <w:proofErr w:type="spellEnd"/>
       <w:r>
         <w:rPr>
+          <w:rFonts w:ascii="Arial" w:hAnsi="Arial" w:cs="Arial"/>
           <w:lang w:val="en-US"/>
         </w:rPr>
         <w:t>)</w:t>
@@ -677,7 +821,9 @@
     </w:p>
     <w:p>
       <w:pPr>
-        <w:rPr>
+        <w:jc w:val="both"/>
+        <w:rPr>
+          <w:rFonts w:ascii="Arial" w:hAnsi="Arial" w:cs="Arial"/>
           <w:lang w:val="en-US"/>
         </w:rPr>
       </w:pPr>
@@ -717,8 +863,9 @@
           <w:p>
             <w:pPr>
               <w:spacing w:after="0" w:line="240" w:lineRule="auto"/>
-              <w:rPr>
-                <w:rFonts w:ascii="Segoe UI" w:eastAsia="Times New Roman" w:hAnsi="Segoe UI" w:cs="Segoe UI"/>
+              <w:jc w:val="both"/>
+              <w:rPr>
+                <w:rFonts w:ascii="Arial" w:eastAsia="Times New Roman" w:hAnsi="Arial" w:cs="Arial"/>
                 <w:b/>
                 <w:bCs/>
                 <w:kern w:val="0"/>
@@ -731,7 +878,7 @@
             <w:proofErr w:type="spellStart"/>
             <w:r>
               <w:rPr>
-                <w:rFonts w:ascii="Segoe UI" w:eastAsia="Times New Roman" w:hAnsi="Segoe UI" w:cs="Segoe UI"/>
+                <w:rFonts w:ascii="Arial" w:eastAsia="Times New Roman" w:hAnsi="Arial" w:cs="Arial"/>
                 <w:b/>
                 <w:bCs/>
                 <w:kern w:val="0"/>
@@ -760,8 +907,9 @@
           <w:p>
             <w:pPr>
               <w:spacing w:after="0" w:line="240" w:lineRule="auto"/>
-              <w:rPr>
-                <w:rFonts w:ascii="Segoe UI" w:eastAsia="Times New Roman" w:hAnsi="Segoe UI" w:cs="Segoe UI"/>
+              <w:jc w:val="both"/>
+              <w:rPr>
+                <w:rFonts w:ascii="Arial" w:eastAsia="Times New Roman" w:hAnsi="Arial" w:cs="Arial"/>
                 <w:b/>
                 <w:bCs/>
                 <w:kern w:val="0"/>
@@ -774,7 +922,7 @@
             <w:proofErr w:type="spellStart"/>
             <w:r>
               <w:rPr>
-                <w:rFonts w:ascii="Segoe UI" w:eastAsia="Times New Roman" w:hAnsi="Segoe UI" w:cs="Segoe UI"/>
+                <w:rFonts w:ascii="Arial" w:eastAsia="Times New Roman" w:hAnsi="Arial" w:cs="Arial"/>
                 <w:b/>
                 <w:bCs/>
                 <w:kern w:val="0"/>
@@ -788,7 +936,7 @@
             <w:proofErr w:type="spellEnd"/>
             <w:r>
               <w:rPr>
-                <w:rFonts w:ascii="Segoe UI" w:eastAsia="Times New Roman" w:hAnsi="Segoe UI" w:cs="Segoe UI"/>
+                <w:rFonts w:ascii="Arial" w:eastAsia="Times New Roman" w:hAnsi="Arial" w:cs="Arial"/>
                 <w:b/>
                 <w:bCs/>
                 <w:kern w:val="0"/>
@@ -802,7 +950,7 @@
             <w:proofErr w:type="spellStart"/>
             <w:r>
               <w:rPr>
-                <w:rFonts w:ascii="Segoe UI" w:eastAsia="Times New Roman" w:hAnsi="Segoe UI" w:cs="Segoe UI"/>
+                <w:rFonts w:ascii="Arial" w:eastAsia="Times New Roman" w:hAnsi="Arial" w:cs="Arial"/>
                 <w:b/>
                 <w:bCs/>
                 <w:kern w:val="0"/>
@@ -831,8 +979,9 @@
           <w:p>
             <w:pPr>
               <w:spacing w:after="0" w:line="240" w:lineRule="auto"/>
-              <w:rPr>
-                <w:rFonts w:ascii="Segoe UI" w:eastAsia="Times New Roman" w:hAnsi="Segoe UI" w:cs="Segoe UI"/>
+              <w:jc w:val="both"/>
+              <w:rPr>
+                <w:rFonts w:ascii="Arial" w:eastAsia="Times New Roman" w:hAnsi="Arial" w:cs="Arial"/>
                 <w:b/>
                 <w:bCs/>
                 <w:kern w:val="0"/>
@@ -845,7 +994,7 @@
             <w:proofErr w:type="spellStart"/>
             <w:r>
               <w:rPr>
-                <w:rFonts w:ascii="Segoe UI" w:eastAsia="Times New Roman" w:hAnsi="Segoe UI" w:cs="Segoe UI"/>
+                <w:rFonts w:ascii="Arial" w:eastAsia="Times New Roman" w:hAnsi="Arial" w:cs="Arial"/>
                 <w:b/>
                 <w:bCs/>
                 <w:kern w:val="0"/>
@@ -859,7 +1008,7 @@
             <w:proofErr w:type="spellEnd"/>
             <w:r>
               <w:rPr>
-                <w:rFonts w:ascii="Segoe UI" w:eastAsia="Times New Roman" w:hAnsi="Segoe UI" w:cs="Segoe UI"/>
+                <w:rFonts w:ascii="Arial" w:eastAsia="Times New Roman" w:hAnsi="Arial" w:cs="Arial"/>
                 <w:b/>
                 <w:bCs/>
                 <w:kern w:val="0"/>
@@ -873,7 +1022,7 @@
             <w:proofErr w:type="spellStart"/>
             <w:r>
               <w:rPr>
-                <w:rFonts w:ascii="Segoe UI" w:eastAsia="Times New Roman" w:hAnsi="Segoe UI" w:cs="Segoe UI"/>
+                <w:rFonts w:ascii="Arial" w:eastAsia="Times New Roman" w:hAnsi="Arial" w:cs="Arial"/>
                 <w:b/>
                 <w:bCs/>
                 <w:kern w:val="0"/>
@@ -887,7 +1036,7 @@
             <w:proofErr w:type="spellEnd"/>
             <w:r>
               <w:rPr>
-                <w:rFonts w:ascii="Segoe UI" w:eastAsia="Times New Roman" w:hAnsi="Segoe UI" w:cs="Segoe UI"/>
+                <w:rFonts w:ascii="Arial" w:eastAsia="Times New Roman" w:hAnsi="Arial" w:cs="Arial"/>
                 <w:b/>
                 <w:bCs/>
                 <w:kern w:val="0"/>
@@ -901,7 +1050,7 @@
             <w:proofErr w:type="spellStart"/>
             <w:r>
               <w:rPr>
-                <w:rFonts w:ascii="Segoe UI" w:eastAsia="Times New Roman" w:hAnsi="Segoe UI" w:cs="Segoe UI"/>
+                <w:rFonts w:ascii="Arial" w:eastAsia="Times New Roman" w:hAnsi="Arial" w:cs="Arial"/>
                 <w:b/>
                 <w:bCs/>
                 <w:kern w:val="0"/>
@@ -930,8 +1079,9 @@
           <w:p>
             <w:pPr>
               <w:spacing w:after="0" w:line="240" w:lineRule="auto"/>
-              <w:rPr>
-                <w:rFonts w:ascii="Segoe UI" w:eastAsia="Times New Roman" w:hAnsi="Segoe UI" w:cs="Segoe UI"/>
+              <w:jc w:val="both"/>
+              <w:rPr>
+                <w:rFonts w:ascii="Arial" w:eastAsia="Times New Roman" w:hAnsi="Arial" w:cs="Arial"/>
                 <w:b/>
                 <w:bCs/>
                 <w:kern w:val="0"/>
@@ -944,7 +1094,7 @@
             <w:proofErr w:type="spellStart"/>
             <w:r>
               <w:rPr>
-                <w:rFonts w:ascii="Segoe UI" w:eastAsia="Times New Roman" w:hAnsi="Segoe UI" w:cs="Segoe UI"/>
+                <w:rFonts w:ascii="Arial" w:eastAsia="Times New Roman" w:hAnsi="Arial" w:cs="Arial"/>
                 <w:b/>
                 <w:bCs/>
                 <w:kern w:val="0"/>
@@ -958,7 +1108,7 @@
             <w:proofErr w:type="spellEnd"/>
             <w:r>
               <w:rPr>
-                <w:rFonts w:ascii="Segoe UI" w:eastAsia="Times New Roman" w:hAnsi="Segoe UI" w:cs="Segoe UI"/>
+                <w:rFonts w:ascii="Arial" w:eastAsia="Times New Roman" w:hAnsi="Arial" w:cs="Arial"/>
                 <w:b/>
                 <w:bCs/>
                 <w:kern w:val="0"/>
@@ -972,7 +1122,7 @@
             <w:proofErr w:type="spellStart"/>
             <w:r>
               <w:rPr>
-                <w:rFonts w:ascii="Segoe UI" w:eastAsia="Times New Roman" w:hAnsi="Segoe UI" w:cs="Segoe UI"/>
+                <w:rFonts w:ascii="Arial" w:eastAsia="Times New Roman" w:hAnsi="Arial" w:cs="Arial"/>
                 <w:b/>
                 <w:bCs/>
                 <w:kern w:val="0"/>
@@ -986,7 +1136,7 @@
             <w:proofErr w:type="spellEnd"/>
             <w:r>
               <w:rPr>
-                <w:rFonts w:ascii="Segoe UI" w:eastAsia="Times New Roman" w:hAnsi="Segoe UI" w:cs="Segoe UI"/>
+                <w:rFonts w:ascii="Arial" w:eastAsia="Times New Roman" w:hAnsi="Arial" w:cs="Arial"/>
                 <w:b/>
                 <w:bCs/>
                 <w:kern w:val="0"/>
@@ -1000,7 +1150,7 @@
             <w:proofErr w:type="spellStart"/>
             <w:r>
               <w:rPr>
-                <w:rFonts w:ascii="Segoe UI" w:eastAsia="Times New Roman" w:hAnsi="Segoe UI" w:cs="Segoe UI"/>
+                <w:rFonts w:ascii="Arial" w:eastAsia="Times New Roman" w:hAnsi="Arial" w:cs="Arial"/>
                 <w:b/>
                 <w:bCs/>
                 <w:kern w:val="0"/>
@@ -1034,8 +1184,9 @@
           <w:p>
             <w:pPr>
               <w:spacing w:after="0" w:line="240" w:lineRule="auto"/>
-              <w:rPr>
-                <w:rFonts w:ascii="Segoe UI" w:eastAsia="Times New Roman" w:hAnsi="Segoe UI" w:cs="Segoe UI"/>
+              <w:jc w:val="both"/>
+              <w:rPr>
+                <w:rFonts w:ascii="Arial" w:eastAsia="Times New Roman" w:hAnsi="Arial" w:cs="Arial"/>
                 <w:b/>
                 <w:bCs/>
                 <w:kern w:val="0"/>
@@ -1048,7 +1199,7 @@
             <w:proofErr w:type="spellStart"/>
             <w:r>
               <w:rPr>
-                <w:rFonts w:ascii="Segoe UI" w:eastAsia="Times New Roman" w:hAnsi="Segoe UI" w:cs="Segoe UI"/>
+                <w:rFonts w:ascii="Arial" w:eastAsia="Times New Roman" w:hAnsi="Arial" w:cs="Arial"/>
                 <w:b/>
                 <w:bCs/>
                 <w:kern w:val="0"/>
@@ -1062,7 +1213,7 @@
             <w:proofErr w:type="spellEnd"/>
             <w:r>
               <w:rPr>
-                <w:rFonts w:ascii="Segoe UI" w:eastAsia="Times New Roman" w:hAnsi="Segoe UI" w:cs="Segoe UI"/>
+                <w:rFonts w:ascii="Arial" w:eastAsia="Times New Roman" w:hAnsi="Arial" w:cs="Arial"/>
                 <w:b/>
                 <w:bCs/>
                 <w:kern w:val="0"/>
@@ -1076,7 +1227,7 @@
             <w:proofErr w:type="spellStart"/>
             <w:r>
               <w:rPr>
-                <w:rFonts w:ascii="Segoe UI" w:eastAsia="Times New Roman" w:hAnsi="Segoe UI" w:cs="Segoe UI"/>
+                <w:rFonts w:ascii="Arial" w:eastAsia="Times New Roman" w:hAnsi="Arial" w:cs="Arial"/>
                 <w:b/>
                 <w:bCs/>
                 <w:kern w:val="0"/>
@@ -1090,7 +1241,7 @@
             <w:proofErr w:type="spellEnd"/>
             <w:r>
               <w:rPr>
-                <w:rFonts w:ascii="Segoe UI" w:eastAsia="Times New Roman" w:hAnsi="Segoe UI" w:cs="Segoe UI"/>
+                <w:rFonts w:ascii="Arial" w:eastAsia="Times New Roman" w:hAnsi="Arial" w:cs="Arial"/>
                 <w:b/>
                 <w:bCs/>
                 <w:kern w:val="0"/>
@@ -1103,7 +1254,7 @@
             </w:r>
             <w:r>
               <w:rPr>
-                <w:rFonts w:ascii="Segoe UI" w:eastAsia="Times New Roman" w:hAnsi="Segoe UI" w:cs="Segoe UI"/>
+                <w:rFonts w:ascii="Arial" w:eastAsia="Times New Roman" w:hAnsi="Arial" w:cs="Arial"/>
                 <w:i/>
                 <w:iCs/>
                 <w:kern w:val="0"/>
@@ -1131,8 +1282,9 @@
           <w:p>
             <w:pPr>
               <w:spacing w:after="0" w:line="240" w:lineRule="auto"/>
-              <w:rPr>
-                <w:rFonts w:ascii="Segoe UI" w:eastAsia="Times New Roman" w:hAnsi="Segoe UI" w:cs="Segoe UI"/>
+              <w:jc w:val="both"/>
+              <w:rPr>
+                <w:rFonts w:ascii="Arial" w:eastAsia="Times New Roman" w:hAnsi="Arial" w:cs="Arial"/>
                 <w:b/>
                 <w:bCs/>
                 <w:kern w:val="0"/>
@@ -1144,7 +1296,7 @@
             </w:pPr>
             <w:r>
               <w:rPr>
-                <w:rFonts w:ascii="Segoe UI" w:eastAsia="Times New Roman" w:hAnsi="Segoe UI" w:cs="Segoe UI"/>
+                <w:rFonts w:ascii="Arial" w:eastAsia="Times New Roman" w:hAnsi="Arial" w:cs="Arial"/>
                 <w:b/>
                 <w:bCs/>
                 <w:kern w:val="0"/>
@@ -1157,7 +1309,7 @@
             </w:r>
             <w:r>
               <w:rPr>
-                <w:rFonts w:ascii="Segoe UI" w:eastAsia="Times New Roman" w:hAnsi="Segoe UI" w:cs="Segoe UI"/>
+                <w:rFonts w:ascii="Arial" w:eastAsia="Times New Roman" w:hAnsi="Arial" w:cs="Arial"/>
                 <w:kern w:val="0"/>
                 <w:sz w:val="16"/>
                 <w:szCs w:val="16"/>
@@ -1169,7 +1321,7 @@
             <w:proofErr w:type="spellStart"/>
             <w:r>
               <w:rPr>
-                <w:rFonts w:ascii="Segoe UI" w:eastAsia="Times New Roman" w:hAnsi="Segoe UI" w:cs="Segoe UI"/>
+                <w:rFonts w:ascii="Arial" w:eastAsia="Times New Roman" w:hAnsi="Arial" w:cs="Arial"/>
                 <w:kern w:val="0"/>
                 <w:sz w:val="16"/>
                 <w:szCs w:val="16"/>
@@ -1181,7 +1333,7 @@
             <w:proofErr w:type="spellEnd"/>
             <w:r>
               <w:rPr>
-                <w:rFonts w:ascii="Segoe UI" w:eastAsia="Times New Roman" w:hAnsi="Segoe UI" w:cs="Segoe UI"/>
+                <w:rFonts w:ascii="Arial" w:eastAsia="Times New Roman" w:hAnsi="Arial" w:cs="Arial"/>
                 <w:kern w:val="0"/>
                 <w:sz w:val="16"/>
                 <w:szCs w:val="16"/>
@@ -1193,7 +1345,7 @@
             <w:proofErr w:type="spellStart"/>
             <w:r>
               <w:rPr>
-                <w:rFonts w:ascii="Segoe UI" w:eastAsia="Times New Roman" w:hAnsi="Segoe UI" w:cs="Segoe UI"/>
+                <w:rFonts w:ascii="Arial" w:eastAsia="Times New Roman" w:hAnsi="Arial" w:cs="Arial"/>
                 <w:kern w:val="0"/>
                 <w:sz w:val="16"/>
                 <w:szCs w:val="16"/>
@@ -1205,7 +1357,7 @@
             <w:proofErr w:type="spellEnd"/>
             <w:r>
               <w:rPr>
-                <w:rFonts w:ascii="Segoe UI" w:eastAsia="Times New Roman" w:hAnsi="Segoe UI" w:cs="Segoe UI"/>
+                <w:rFonts w:ascii="Arial" w:eastAsia="Times New Roman" w:hAnsi="Arial" w:cs="Arial"/>
                 <w:kern w:val="0"/>
                 <w:sz w:val="16"/>
                 <w:szCs w:val="16"/>
@@ -1231,8 +1383,9 @@
           <w:p>
             <w:pPr>
               <w:spacing w:after="0" w:line="240" w:lineRule="auto"/>
-              <w:rPr>
-                <w:rFonts w:ascii="Segoe UI" w:eastAsia="Times New Roman" w:hAnsi="Segoe UI" w:cs="Segoe UI"/>
+              <w:jc w:val="both"/>
+              <w:rPr>
+                <w:rFonts w:ascii="Arial" w:eastAsia="Times New Roman" w:hAnsi="Arial" w:cs="Arial"/>
                 <w:b/>
                 <w:bCs/>
                 <w:kern w:val="0"/>
@@ -1244,7 +1397,7 @@
             </w:pPr>
             <w:r>
               <w:rPr>
-                <w:rFonts w:ascii="Segoe UI" w:eastAsia="Times New Roman" w:hAnsi="Segoe UI" w:cs="Segoe UI"/>
+                <w:rFonts w:ascii="Arial" w:eastAsia="Times New Roman" w:hAnsi="Arial" w:cs="Arial"/>
                 <w:b/>
                 <w:bCs/>
                 <w:kern w:val="0"/>
@@ -1257,7 +1410,7 @@
             </w:r>
             <w:r>
               <w:rPr>
-                <w:rFonts w:ascii="Segoe UI" w:eastAsia="Times New Roman" w:hAnsi="Segoe UI" w:cs="Segoe UI"/>
+                <w:rFonts w:ascii="Arial" w:eastAsia="Times New Roman" w:hAnsi="Arial" w:cs="Arial"/>
                 <w:kern w:val="0"/>
                 <w:sz w:val="16"/>
                 <w:szCs w:val="16"/>
@@ -1283,8 +1436,9 @@
           <w:p>
             <w:pPr>
               <w:spacing w:after="0" w:line="240" w:lineRule="auto"/>
-              <w:rPr>
-                <w:rFonts w:ascii="Segoe UI" w:eastAsia="Times New Roman" w:hAnsi="Segoe UI" w:cs="Segoe UI"/>
+              <w:jc w:val="both"/>
+              <w:rPr>
+                <w:rFonts w:ascii="Arial" w:eastAsia="Times New Roman" w:hAnsi="Arial" w:cs="Arial"/>
                 <w:b/>
                 <w:bCs/>
                 <w:kern w:val="0"/>
@@ -1296,7 +1450,7 @@
             </w:pPr>
             <w:r>
               <w:rPr>
-                <w:rFonts w:ascii="Segoe UI" w:eastAsia="Times New Roman" w:hAnsi="Segoe UI" w:cs="Segoe UI"/>
+                <w:rFonts w:ascii="Arial" w:eastAsia="Times New Roman" w:hAnsi="Arial" w:cs="Arial"/>
                 <w:b/>
                 <w:bCs/>
                 <w:kern w:val="0"/>
@@ -1309,7 +1463,7 @@
             </w:r>
             <w:r>
               <w:rPr>
-                <w:rFonts w:ascii="Segoe UI" w:eastAsia="Times New Roman" w:hAnsi="Segoe UI" w:cs="Segoe UI"/>
+                <w:rFonts w:ascii="Arial" w:eastAsia="Times New Roman" w:hAnsi="Arial" w:cs="Arial"/>
                 <w:kern w:val="0"/>
                 <w:sz w:val="16"/>
                 <w:szCs w:val="16"/>
@@ -1321,7 +1475,7 @@
             <w:proofErr w:type="spellStart"/>
             <w:r>
               <w:rPr>
-                <w:rFonts w:ascii="Segoe UI" w:eastAsia="Times New Roman" w:hAnsi="Segoe UI" w:cs="Segoe UI"/>
+                <w:rFonts w:ascii="Arial" w:eastAsia="Times New Roman" w:hAnsi="Arial" w:cs="Arial"/>
                 <w:kern w:val="0"/>
                 <w:sz w:val="16"/>
                 <w:szCs w:val="16"/>
@@ -1333,7 +1487,7 @@
             <w:proofErr w:type="spellEnd"/>
             <w:r>
               <w:rPr>
-                <w:rFonts w:ascii="Segoe UI" w:eastAsia="Times New Roman" w:hAnsi="Segoe UI" w:cs="Segoe UI"/>
+                <w:rFonts w:ascii="Arial" w:eastAsia="Times New Roman" w:hAnsi="Arial" w:cs="Arial"/>
                 <w:kern w:val="0"/>
                 <w:sz w:val="16"/>
                 <w:szCs w:val="16"/>
@@ -1344,7 +1498,7 @@
             </w:r>
             <w:r>
               <w:rPr>
-                <w:rFonts w:ascii="Segoe UI" w:eastAsia="Times New Roman" w:hAnsi="Segoe UI" w:cs="Segoe UI"/>
+                <w:rFonts w:ascii="Arial" w:eastAsia="Times New Roman" w:hAnsi="Arial" w:cs="Arial"/>
                 <w:kern w:val="0"/>
                 <w:sz w:val="16"/>
                 <w:szCs w:val="16"/>
@@ -1356,7 +1510,7 @@
             <w:proofErr w:type="spellStart"/>
             <w:r>
               <w:rPr>
-                <w:rFonts w:ascii="Segoe UI" w:eastAsia="Times New Roman" w:hAnsi="Segoe UI" w:cs="Segoe UI"/>
+                <w:rFonts w:ascii="Arial" w:eastAsia="Times New Roman" w:hAnsi="Arial" w:cs="Arial"/>
                 <w:kern w:val="0"/>
                 <w:sz w:val="16"/>
                 <w:szCs w:val="16"/>
@@ -1368,7 +1522,7 @@
             <w:proofErr w:type="spellEnd"/>
             <w:r>
               <w:rPr>
-                <w:rFonts w:ascii="Segoe UI" w:eastAsia="Times New Roman" w:hAnsi="Segoe UI" w:cs="Segoe UI"/>
+                <w:rFonts w:ascii="Arial" w:eastAsia="Times New Roman" w:hAnsi="Arial" w:cs="Arial"/>
                 <w:kern w:val="0"/>
                 <w:sz w:val="16"/>
                 <w:szCs w:val="16"/>
@@ -1380,7 +1534,7 @@
             <w:proofErr w:type="spellStart"/>
             <w:r>
               <w:rPr>
-                <w:rFonts w:ascii="Segoe UI" w:eastAsia="Times New Roman" w:hAnsi="Segoe UI" w:cs="Segoe UI"/>
+                <w:rFonts w:ascii="Arial" w:eastAsia="Times New Roman" w:hAnsi="Arial" w:cs="Arial"/>
                 <w:kern w:val="0"/>
                 <w:sz w:val="16"/>
                 <w:szCs w:val="16"/>
@@ -1392,7 +1546,7 @@
             <w:proofErr w:type="spellEnd"/>
             <w:r>
               <w:rPr>
-                <w:rFonts w:ascii="Segoe UI" w:eastAsia="Times New Roman" w:hAnsi="Segoe UI" w:cs="Segoe UI"/>
+                <w:rFonts w:ascii="Arial" w:eastAsia="Times New Roman" w:hAnsi="Arial" w:cs="Arial"/>
                 <w:kern w:val="0"/>
                 <w:sz w:val="16"/>
                 <w:szCs w:val="16"/>
@@ -1404,7 +1558,7 @@
             <w:proofErr w:type="spellStart"/>
             <w:r>
               <w:rPr>
-                <w:rFonts w:ascii="Segoe UI" w:eastAsia="Times New Roman" w:hAnsi="Segoe UI" w:cs="Segoe UI"/>
+                <w:rFonts w:ascii="Arial" w:eastAsia="Times New Roman" w:hAnsi="Arial" w:cs="Arial"/>
                 <w:kern w:val="0"/>
                 <w:sz w:val="16"/>
                 <w:szCs w:val="16"/>
@@ -1416,7 +1570,7 @@
             <w:proofErr w:type="spellEnd"/>
             <w:r>
               <w:rPr>
-                <w:rFonts w:ascii="Segoe UI" w:eastAsia="Times New Roman" w:hAnsi="Segoe UI" w:cs="Segoe UI"/>
+                <w:rFonts w:ascii="Arial" w:eastAsia="Times New Roman" w:hAnsi="Arial" w:cs="Arial"/>
                 <w:kern w:val="0"/>
                 <w:sz w:val="16"/>
                 <w:szCs w:val="16"/>
@@ -1447,8 +1601,9 @@
           <w:p>
             <w:pPr>
               <w:spacing w:after="0" w:line="240" w:lineRule="auto"/>
-              <w:rPr>
-                <w:rFonts w:ascii="Segoe UI" w:eastAsia="Times New Roman" w:hAnsi="Segoe UI" w:cs="Segoe UI"/>
+              <w:jc w:val="both"/>
+              <w:rPr>
+                <w:rFonts w:ascii="Arial" w:eastAsia="Times New Roman" w:hAnsi="Arial" w:cs="Arial"/>
                 <w:b/>
                 <w:bCs/>
                 <w:kern w:val="0"/>
@@ -1461,7 +1616,7 @@
             <w:proofErr w:type="spellStart"/>
             <w:r>
               <w:rPr>
-                <w:rFonts w:ascii="Segoe UI" w:eastAsia="Times New Roman" w:hAnsi="Segoe UI" w:cs="Segoe UI"/>
+                <w:rFonts w:ascii="Arial" w:eastAsia="Times New Roman" w:hAnsi="Arial" w:cs="Arial"/>
                 <w:b/>
                 <w:bCs/>
                 <w:kern w:val="0"/>
@@ -1475,7 +1630,7 @@
             <w:proofErr w:type="spellEnd"/>
             <w:r>
               <w:rPr>
-                <w:rFonts w:ascii="Segoe UI" w:eastAsia="Times New Roman" w:hAnsi="Segoe UI" w:cs="Segoe UI"/>
+                <w:rFonts w:ascii="Arial" w:eastAsia="Times New Roman" w:hAnsi="Arial" w:cs="Arial"/>
                 <w:b/>
                 <w:bCs/>
                 <w:kern w:val="0"/>
@@ -1489,7 +1644,7 @@
             <w:proofErr w:type="spellStart"/>
             <w:r>
               <w:rPr>
-                <w:rFonts w:ascii="Segoe UI" w:eastAsia="Times New Roman" w:hAnsi="Segoe UI" w:cs="Segoe UI"/>
+                <w:rFonts w:ascii="Arial" w:eastAsia="Times New Roman" w:hAnsi="Arial" w:cs="Arial"/>
                 <w:b/>
                 <w:bCs/>
                 <w:kern w:val="0"/>
@@ -1503,7 +1658,7 @@
             <w:proofErr w:type="spellEnd"/>
             <w:r>
               <w:rPr>
-                <w:rFonts w:ascii="Segoe UI" w:eastAsia="Times New Roman" w:hAnsi="Segoe UI" w:cs="Segoe UI"/>
+                <w:rFonts w:ascii="Arial" w:eastAsia="Times New Roman" w:hAnsi="Arial" w:cs="Arial"/>
                 <w:b/>
                 <w:bCs/>
                 <w:kern w:val="0"/>
@@ -1516,7 +1671,7 @@
             </w:r>
             <w:r>
               <w:rPr>
-                <w:rFonts w:ascii="Segoe UI" w:eastAsia="Times New Roman" w:hAnsi="Segoe UI" w:cs="Segoe UI"/>
+                <w:rFonts w:ascii="Arial" w:eastAsia="Times New Roman" w:hAnsi="Arial" w:cs="Arial"/>
                 <w:i/>
                 <w:iCs/>
                 <w:kern w:val="0"/>
@@ -1544,8 +1699,9 @@
           <w:p>
             <w:pPr>
               <w:spacing w:after="0" w:line="240" w:lineRule="auto"/>
-              <w:rPr>
-                <w:rFonts w:ascii="Segoe UI" w:eastAsia="Times New Roman" w:hAnsi="Segoe UI" w:cs="Segoe UI"/>
+              <w:jc w:val="both"/>
+              <w:rPr>
+                <w:rFonts w:ascii="Arial" w:eastAsia="Times New Roman" w:hAnsi="Arial" w:cs="Arial"/>
                 <w:b/>
                 <w:bCs/>
                 <w:kern w:val="0"/>
@@ -1557,7 +1713,7 @@
             </w:pPr>
             <w:r>
               <w:rPr>
-                <w:rFonts w:ascii="Segoe UI" w:eastAsia="Times New Roman" w:hAnsi="Segoe UI" w:cs="Segoe UI"/>
+                <w:rFonts w:ascii="Arial" w:eastAsia="Times New Roman" w:hAnsi="Arial" w:cs="Arial"/>
                 <w:b/>
                 <w:bCs/>
                 <w:kern w:val="0"/>
@@ -1570,7 +1726,7 @@
             </w:r>
             <w:r>
               <w:rPr>
-                <w:rFonts w:ascii="Segoe UI" w:eastAsia="Times New Roman" w:hAnsi="Segoe UI" w:cs="Segoe UI"/>
+                <w:rFonts w:ascii="Arial" w:eastAsia="Times New Roman" w:hAnsi="Arial" w:cs="Arial"/>
                 <w:kern w:val="0"/>
                 <w:sz w:val="16"/>
                 <w:szCs w:val="16"/>
@@ -1581,7 +1737,7 @@
             </w:r>
             <w:r>
               <w:rPr>
-                <w:rFonts w:ascii="Segoe UI" w:eastAsia="Times New Roman" w:hAnsi="Segoe UI" w:cs="Segoe UI"/>
+                <w:rFonts w:ascii="Arial" w:eastAsia="Times New Roman" w:hAnsi="Arial" w:cs="Arial"/>
                 <w:kern w:val="0"/>
                 <w:sz w:val="16"/>
                 <w:szCs w:val="16"/>
@@ -1593,7 +1749,7 @@
             <w:proofErr w:type="spellStart"/>
             <w:r>
               <w:rPr>
-                <w:rFonts w:ascii="Segoe UI" w:eastAsia="Times New Roman" w:hAnsi="Segoe UI" w:cs="Segoe UI"/>
+                <w:rFonts w:ascii="Arial" w:eastAsia="Times New Roman" w:hAnsi="Arial" w:cs="Arial"/>
                 <w:kern w:val="0"/>
                 <w:sz w:val="16"/>
                 <w:szCs w:val="16"/>
@@ -1605,7 +1761,7 @@
             <w:proofErr w:type="spellEnd"/>
             <w:r>
               <w:rPr>
-                <w:rFonts w:ascii="Segoe UI" w:eastAsia="Times New Roman" w:hAnsi="Segoe UI" w:cs="Segoe UI"/>
+                <w:rFonts w:ascii="Arial" w:eastAsia="Times New Roman" w:hAnsi="Arial" w:cs="Arial"/>
                 <w:kern w:val="0"/>
                 <w:sz w:val="16"/>
                 <w:szCs w:val="16"/>
@@ -1617,7 +1773,7 @@
             <w:proofErr w:type="spellStart"/>
             <w:r>
               <w:rPr>
-                <w:rFonts w:ascii="Segoe UI" w:eastAsia="Times New Roman" w:hAnsi="Segoe UI" w:cs="Segoe UI"/>
+                <w:rFonts w:ascii="Arial" w:eastAsia="Times New Roman" w:hAnsi="Arial" w:cs="Arial"/>
                 <w:kern w:val="0"/>
                 <w:sz w:val="16"/>
                 <w:szCs w:val="16"/>
@@ -1629,7 +1785,7 @@
             <w:proofErr w:type="spellEnd"/>
             <w:r>
               <w:rPr>
-                <w:rFonts w:ascii="Segoe UI" w:eastAsia="Times New Roman" w:hAnsi="Segoe UI" w:cs="Segoe UI"/>
+                <w:rFonts w:ascii="Arial" w:eastAsia="Times New Roman" w:hAnsi="Arial" w:cs="Arial"/>
                 <w:kern w:val="0"/>
                 <w:sz w:val="16"/>
                 <w:szCs w:val="16"/>
@@ -1655,8 +1811,9 @@
           <w:p>
             <w:pPr>
               <w:spacing w:after="0" w:line="240" w:lineRule="auto"/>
-              <w:rPr>
-                <w:rFonts w:ascii="Segoe UI" w:eastAsia="Times New Roman" w:hAnsi="Segoe UI" w:cs="Segoe UI"/>
+              <w:jc w:val="both"/>
+              <w:rPr>
+                <w:rFonts w:ascii="Arial" w:eastAsia="Times New Roman" w:hAnsi="Arial" w:cs="Arial"/>
                 <w:b/>
                 <w:bCs/>
                 <w:kern w:val="0"/>
@@ -1668,7 +1825,7 @@
             </w:pPr>
             <w:r>
               <w:rPr>
-                <w:rFonts w:ascii="Segoe UI" w:eastAsia="Times New Roman" w:hAnsi="Segoe UI" w:cs="Segoe UI"/>
+                <w:rFonts w:ascii="Arial" w:eastAsia="Times New Roman" w:hAnsi="Arial" w:cs="Arial"/>
                 <w:b/>
                 <w:bCs/>
                 <w:kern w:val="0"/>
@@ -1681,7 +1838,7 @@
             </w:r>
             <w:r>
               <w:rPr>
-                <w:rFonts w:ascii="Segoe UI" w:eastAsia="Times New Roman" w:hAnsi="Segoe UI" w:cs="Segoe UI"/>
+                <w:rFonts w:ascii="Arial" w:eastAsia="Times New Roman" w:hAnsi="Arial" w:cs="Arial"/>
                 <w:kern w:val="0"/>
                 <w:sz w:val="16"/>
                 <w:szCs w:val="16"/>
@@ -1707,8 +1864,9 @@
           <w:p>
             <w:pPr>
               <w:spacing w:after="0" w:line="240" w:lineRule="auto"/>
-              <w:rPr>
-                <w:rFonts w:ascii="Segoe UI" w:eastAsia="Times New Roman" w:hAnsi="Segoe UI" w:cs="Segoe UI"/>
+              <w:jc w:val="both"/>
+              <w:rPr>
+                <w:rFonts w:ascii="Arial" w:eastAsia="Times New Roman" w:hAnsi="Arial" w:cs="Arial"/>
                 <w:b/>
                 <w:bCs/>
                 <w:kern w:val="0"/>
@@ -1720,7 +1878,7 @@
             </w:pPr>
             <w:r>
               <w:rPr>
-                <w:rFonts w:ascii="Segoe UI" w:eastAsia="Times New Roman" w:hAnsi="Segoe UI" w:cs="Segoe UI"/>
+                <w:rFonts w:ascii="Arial" w:eastAsia="Times New Roman" w:hAnsi="Arial" w:cs="Arial"/>
                 <w:b/>
                 <w:bCs/>
                 <w:kern w:val="0"/>
@@ -1733,7 +1891,7 @@
             </w:r>
             <w:r>
               <w:rPr>
-                <w:rFonts w:ascii="Segoe UI" w:eastAsia="Times New Roman" w:hAnsi="Segoe UI" w:cs="Segoe UI"/>
+                <w:rFonts w:ascii="Arial" w:eastAsia="Times New Roman" w:hAnsi="Arial" w:cs="Arial"/>
                 <w:kern w:val="0"/>
                 <w:sz w:val="16"/>
                 <w:szCs w:val="16"/>
@@ -1745,7 +1903,7 @@
             <w:proofErr w:type="spellStart"/>
             <w:r>
               <w:rPr>
-                <w:rFonts w:ascii="Segoe UI" w:eastAsia="Times New Roman" w:hAnsi="Segoe UI" w:cs="Segoe UI"/>
+                <w:rFonts w:ascii="Arial" w:eastAsia="Times New Roman" w:hAnsi="Arial" w:cs="Arial"/>
                 <w:kern w:val="0"/>
                 <w:sz w:val="16"/>
                 <w:szCs w:val="16"/>
@@ -1757,7 +1915,7 @@
             <w:proofErr w:type="spellEnd"/>
             <w:r>
               <w:rPr>
-                <w:rFonts w:ascii="Segoe UI" w:eastAsia="Times New Roman" w:hAnsi="Segoe UI" w:cs="Segoe UI"/>
+                <w:rFonts w:ascii="Arial" w:eastAsia="Times New Roman" w:hAnsi="Arial" w:cs="Arial"/>
                 <w:kern w:val="0"/>
                 <w:sz w:val="16"/>
                 <w:szCs w:val="16"/>
@@ -1769,7 +1927,7 @@
             <w:proofErr w:type="spellStart"/>
             <w:r>
               <w:rPr>
-                <w:rFonts w:ascii="Segoe UI" w:eastAsia="Times New Roman" w:hAnsi="Segoe UI" w:cs="Segoe UI"/>
+                <w:rFonts w:ascii="Arial" w:eastAsia="Times New Roman" w:hAnsi="Arial" w:cs="Arial"/>
                 <w:kern w:val="0"/>
                 <w:sz w:val="16"/>
                 <w:szCs w:val="16"/>
@@ -1781,7 +1939,7 @@
             <w:proofErr w:type="spellEnd"/>
             <w:r>
               <w:rPr>
-                <w:rFonts w:ascii="Segoe UI" w:eastAsia="Times New Roman" w:hAnsi="Segoe UI" w:cs="Segoe UI"/>
+                <w:rFonts w:ascii="Arial" w:eastAsia="Times New Roman" w:hAnsi="Arial" w:cs="Arial"/>
                 <w:kern w:val="0"/>
                 <w:sz w:val="16"/>
                 <w:szCs w:val="16"/>
@@ -1793,7 +1951,7 @@
             <w:proofErr w:type="spellStart"/>
             <w:r>
               <w:rPr>
-                <w:rFonts w:ascii="Segoe UI" w:eastAsia="Times New Roman" w:hAnsi="Segoe UI" w:cs="Segoe UI"/>
+                <w:rFonts w:ascii="Arial" w:eastAsia="Times New Roman" w:hAnsi="Arial" w:cs="Arial"/>
                 <w:kern w:val="0"/>
                 <w:sz w:val="16"/>
                 <w:szCs w:val="16"/>
@@ -1805,7 +1963,7 @@
             <w:proofErr w:type="spellEnd"/>
             <w:r>
               <w:rPr>
-                <w:rFonts w:ascii="Segoe UI" w:eastAsia="Times New Roman" w:hAnsi="Segoe UI" w:cs="Segoe UI"/>
+                <w:rFonts w:ascii="Arial" w:eastAsia="Times New Roman" w:hAnsi="Arial" w:cs="Arial"/>
                 <w:kern w:val="0"/>
                 <w:sz w:val="16"/>
                 <w:szCs w:val="16"/>
@@ -1817,7 +1975,7 @@
             <w:proofErr w:type="spellStart"/>
             <w:r>
               <w:rPr>
-                <w:rFonts w:ascii="Segoe UI" w:eastAsia="Times New Roman" w:hAnsi="Segoe UI" w:cs="Segoe UI"/>
+                <w:rFonts w:ascii="Arial" w:eastAsia="Times New Roman" w:hAnsi="Arial" w:cs="Arial"/>
                 <w:kern w:val="0"/>
                 <w:sz w:val="16"/>
                 <w:szCs w:val="16"/>
@@ -1829,7 +1987,7 @@
             <w:proofErr w:type="spellEnd"/>
             <w:r>
               <w:rPr>
-                <w:rFonts w:ascii="Segoe UI" w:eastAsia="Times New Roman" w:hAnsi="Segoe UI" w:cs="Segoe UI"/>
+                <w:rFonts w:ascii="Arial" w:eastAsia="Times New Roman" w:hAnsi="Arial" w:cs="Arial"/>
                 <w:kern w:val="0"/>
                 <w:sz w:val="16"/>
                 <w:szCs w:val="16"/>
@@ -1860,8 +2018,9 @@
           <w:p>
             <w:pPr>
               <w:spacing w:after="0" w:line="240" w:lineRule="auto"/>
-              <w:rPr>
-                <w:rFonts w:ascii="Segoe UI" w:eastAsia="Times New Roman" w:hAnsi="Segoe UI" w:cs="Segoe UI"/>
+              <w:jc w:val="both"/>
+              <w:rPr>
+                <w:rFonts w:ascii="Arial" w:eastAsia="Times New Roman" w:hAnsi="Arial" w:cs="Arial"/>
                 <w:b/>
                 <w:bCs/>
                 <w:kern w:val="0"/>
@@ -1874,7 +2033,7 @@
             <w:proofErr w:type="spellStart"/>
             <w:r>
               <w:rPr>
-                <w:rFonts w:ascii="Segoe UI" w:eastAsia="Times New Roman" w:hAnsi="Segoe UI" w:cs="Segoe UI"/>
+                <w:rFonts w:ascii="Arial" w:eastAsia="Times New Roman" w:hAnsi="Arial" w:cs="Arial"/>
                 <w:b/>
                 <w:bCs/>
                 <w:kern w:val="0"/>
@@ -1888,7 +2047,7 @@
             <w:proofErr w:type="spellEnd"/>
             <w:r>
               <w:rPr>
-                <w:rFonts w:ascii="Segoe UI" w:eastAsia="Times New Roman" w:hAnsi="Segoe UI" w:cs="Segoe UI"/>
+                <w:rFonts w:ascii="Arial" w:eastAsia="Times New Roman" w:hAnsi="Arial" w:cs="Arial"/>
                 <w:b/>
                 <w:bCs/>
                 <w:kern w:val="0"/>
@@ -1902,7 +2061,7 @@
             <w:proofErr w:type="spellStart"/>
             <w:r>
               <w:rPr>
-                <w:rFonts w:ascii="Segoe UI" w:eastAsia="Times New Roman" w:hAnsi="Segoe UI" w:cs="Segoe UI"/>
+                <w:rFonts w:ascii="Arial" w:eastAsia="Times New Roman" w:hAnsi="Arial" w:cs="Arial"/>
                 <w:b/>
                 <w:bCs/>
                 <w:kern w:val="0"/>
@@ -1916,7 +2075,7 @@
             <w:proofErr w:type="spellEnd"/>
             <w:r>
               <w:rPr>
-                <w:rFonts w:ascii="Segoe UI" w:eastAsia="Times New Roman" w:hAnsi="Segoe UI" w:cs="Segoe UI"/>
+                <w:rFonts w:ascii="Arial" w:eastAsia="Times New Roman" w:hAnsi="Arial" w:cs="Arial"/>
                 <w:b/>
                 <w:bCs/>
                 <w:kern w:val="0"/>
@@ -1929,7 +2088,7 @@
             </w:r>
             <w:r>
               <w:rPr>
-                <w:rFonts w:ascii="Segoe UI" w:eastAsia="Times New Roman" w:hAnsi="Segoe UI" w:cs="Segoe UI"/>
+                <w:rFonts w:ascii="Arial" w:eastAsia="Times New Roman" w:hAnsi="Arial" w:cs="Arial"/>
                 <w:i/>
                 <w:iCs/>
                 <w:kern w:val="0"/>
@@ -1957,8 +2116,9 @@
           <w:p>
             <w:pPr>
               <w:spacing w:after="0" w:line="240" w:lineRule="auto"/>
-              <w:rPr>
-                <w:rFonts w:ascii="Segoe UI" w:eastAsia="Times New Roman" w:hAnsi="Segoe UI" w:cs="Segoe UI"/>
+              <w:jc w:val="both"/>
+              <w:rPr>
+                <w:rFonts w:ascii="Arial" w:eastAsia="Times New Roman" w:hAnsi="Arial" w:cs="Arial"/>
                 <w:b/>
                 <w:bCs/>
                 <w:kern w:val="0"/>
@@ -1970,7 +2130,7 @@
             </w:pPr>
             <w:r>
               <w:rPr>
-                <w:rFonts w:ascii="Segoe UI" w:eastAsia="Times New Roman" w:hAnsi="Segoe UI" w:cs="Segoe UI"/>
+                <w:rFonts w:ascii="Arial" w:eastAsia="Times New Roman" w:hAnsi="Arial" w:cs="Arial"/>
                 <w:b/>
                 <w:bCs/>
                 <w:kern w:val="0"/>
@@ -1983,7 +2143,7 @@
             </w:r>
             <w:r>
               <w:rPr>
-                <w:rFonts w:ascii="Segoe UI" w:eastAsia="Times New Roman" w:hAnsi="Segoe UI" w:cs="Segoe UI"/>
+                <w:rFonts w:ascii="Arial" w:eastAsia="Times New Roman" w:hAnsi="Arial" w:cs="Arial"/>
                 <w:kern w:val="0"/>
                 <w:sz w:val="16"/>
                 <w:szCs w:val="16"/>
@@ -1994,7 +2154,7 @@
             </w:r>
             <w:r>
               <w:rPr>
-                <w:rFonts w:ascii="Segoe UI" w:eastAsia="Times New Roman" w:hAnsi="Segoe UI" w:cs="Segoe UI"/>
+                <w:rFonts w:ascii="Arial" w:eastAsia="Times New Roman" w:hAnsi="Arial" w:cs="Arial"/>
                 <w:kern w:val="0"/>
                 <w:sz w:val="16"/>
                 <w:szCs w:val="16"/>
@@ -2006,7 +2166,7 @@
             <w:proofErr w:type="spellStart"/>
             <w:r>
               <w:rPr>
-                <w:rFonts w:ascii="Segoe UI" w:eastAsia="Times New Roman" w:hAnsi="Segoe UI" w:cs="Segoe UI"/>
+                <w:rFonts w:ascii="Arial" w:eastAsia="Times New Roman" w:hAnsi="Arial" w:cs="Arial"/>
                 <w:kern w:val="0"/>
                 <w:sz w:val="16"/>
                 <w:szCs w:val="16"/>
@@ -2018,7 +2178,7 @@
             <w:proofErr w:type="spellEnd"/>
             <w:r>
               <w:rPr>
-                <w:rFonts w:ascii="Segoe UI" w:eastAsia="Times New Roman" w:hAnsi="Segoe UI" w:cs="Segoe UI"/>
+                <w:rFonts w:ascii="Arial" w:eastAsia="Times New Roman" w:hAnsi="Arial" w:cs="Arial"/>
                 <w:kern w:val="0"/>
                 <w:sz w:val="16"/>
                 <w:szCs w:val="16"/>
@@ -2030,7 +2190,7 @@
             <w:proofErr w:type="spellStart"/>
             <w:r>
               <w:rPr>
-                <w:rFonts w:ascii="Segoe UI" w:eastAsia="Times New Roman" w:hAnsi="Segoe UI" w:cs="Segoe UI"/>
+                <w:rFonts w:ascii="Arial" w:eastAsia="Times New Roman" w:hAnsi="Arial" w:cs="Arial"/>
                 <w:kern w:val="0"/>
                 <w:sz w:val="16"/>
                 <w:szCs w:val="16"/>
@@ -2042,7 +2202,7 @@
             <w:proofErr w:type="spellEnd"/>
             <w:r>
               <w:rPr>
-                <w:rFonts w:ascii="Segoe UI" w:eastAsia="Times New Roman" w:hAnsi="Segoe UI" w:cs="Segoe UI"/>
+                <w:rFonts w:ascii="Arial" w:eastAsia="Times New Roman" w:hAnsi="Arial" w:cs="Arial"/>
                 <w:kern w:val="0"/>
                 <w:sz w:val="16"/>
                 <w:szCs w:val="16"/>
@@ -2068,8 +2228,9 @@
           <w:p>
             <w:pPr>
               <w:spacing w:after="0" w:line="240" w:lineRule="auto"/>
-              <w:rPr>
-                <w:rFonts w:ascii="Segoe UI" w:eastAsia="Times New Roman" w:hAnsi="Segoe UI" w:cs="Segoe UI"/>
+              <w:jc w:val="both"/>
+              <w:rPr>
+                <w:rFonts w:ascii="Arial" w:eastAsia="Times New Roman" w:hAnsi="Arial" w:cs="Arial"/>
                 <w:b/>
                 <w:bCs/>
                 <w:kern w:val="0"/>
@@ -2081,7 +2242,7 @@
             </w:pPr>
             <w:r>
               <w:rPr>
-                <w:rFonts w:ascii="Segoe UI" w:eastAsia="Times New Roman" w:hAnsi="Segoe UI" w:cs="Segoe UI"/>
+                <w:rFonts w:ascii="Arial" w:eastAsia="Times New Roman" w:hAnsi="Arial" w:cs="Arial"/>
                 <w:b/>
                 <w:bCs/>
                 <w:kern w:val="0"/>
@@ -2094,7 +2255,7 @@
             </w:r>
             <w:r>
               <w:rPr>
-                <w:rFonts w:ascii="Segoe UI" w:eastAsia="Times New Roman" w:hAnsi="Segoe UI" w:cs="Segoe UI"/>
+                <w:rFonts w:ascii="Arial" w:eastAsia="Times New Roman" w:hAnsi="Arial" w:cs="Arial"/>
                 <w:kern w:val="0"/>
                 <w:sz w:val="16"/>
                 <w:szCs w:val="16"/>
@@ -2106,7 +2267,7 @@
             <w:proofErr w:type="spellStart"/>
             <w:r>
               <w:rPr>
-                <w:rFonts w:ascii="Segoe UI" w:eastAsia="Times New Roman" w:hAnsi="Segoe UI" w:cs="Segoe UI"/>
+                <w:rFonts w:ascii="Arial" w:eastAsia="Times New Roman" w:hAnsi="Arial" w:cs="Arial"/>
                 <w:kern w:val="0"/>
                 <w:sz w:val="16"/>
                 <w:szCs w:val="16"/>
@@ -2118,7 +2279,7 @@
             <w:proofErr w:type="spellEnd"/>
             <w:r>
               <w:rPr>
-                <w:rFonts w:ascii="Segoe UI" w:eastAsia="Times New Roman" w:hAnsi="Segoe UI" w:cs="Segoe UI"/>
+                <w:rFonts w:ascii="Arial" w:eastAsia="Times New Roman" w:hAnsi="Arial" w:cs="Arial"/>
                 <w:kern w:val="0"/>
                 <w:sz w:val="16"/>
                 <w:szCs w:val="16"/>
@@ -2130,7 +2291,7 @@
             <w:proofErr w:type="spellStart"/>
             <w:r>
               <w:rPr>
-                <w:rFonts w:ascii="Segoe UI" w:eastAsia="Times New Roman" w:hAnsi="Segoe UI" w:cs="Segoe UI"/>
+                <w:rFonts w:ascii="Arial" w:eastAsia="Times New Roman" w:hAnsi="Arial" w:cs="Arial"/>
                 <w:kern w:val="0"/>
                 <w:sz w:val="16"/>
                 <w:szCs w:val="16"/>
@@ -2142,7 +2303,7 @@
             <w:proofErr w:type="spellEnd"/>
             <w:r>
               <w:rPr>
-                <w:rFonts w:ascii="Segoe UI" w:eastAsia="Times New Roman" w:hAnsi="Segoe UI" w:cs="Segoe UI"/>
+                <w:rFonts w:ascii="Arial" w:eastAsia="Times New Roman" w:hAnsi="Arial" w:cs="Arial"/>
                 <w:kern w:val="0"/>
                 <w:sz w:val="16"/>
                 <w:szCs w:val="16"/>
@@ -2168,8 +2329,9 @@
           <w:p>
             <w:pPr>
               <w:spacing w:after="0" w:line="240" w:lineRule="auto"/>
-              <w:rPr>
-                <w:rFonts w:ascii="Segoe UI" w:eastAsia="Times New Roman" w:hAnsi="Segoe UI" w:cs="Segoe UI"/>
+              <w:jc w:val="both"/>
+              <w:rPr>
+                <w:rFonts w:ascii="Arial" w:eastAsia="Times New Roman" w:hAnsi="Arial" w:cs="Arial"/>
                 <w:b/>
                 <w:bCs/>
                 <w:kern w:val="0"/>
@@ -2181,7 +2343,7 @@
             </w:pPr>
             <w:r>
               <w:rPr>
-                <w:rFonts w:ascii="Segoe UI" w:eastAsia="Times New Roman" w:hAnsi="Segoe UI" w:cs="Segoe UI"/>
+                <w:rFonts w:ascii="Arial" w:eastAsia="Times New Roman" w:hAnsi="Arial" w:cs="Arial"/>
                 <w:b/>
                 <w:bCs/>
                 <w:kern w:val="0"/>
@@ -2194,7 +2356,7 @@
             </w:r>
             <w:r>
               <w:rPr>
-                <w:rFonts w:ascii="Segoe UI" w:eastAsia="Times New Roman" w:hAnsi="Segoe UI" w:cs="Segoe UI"/>
+                <w:rFonts w:ascii="Arial" w:eastAsia="Times New Roman" w:hAnsi="Arial" w:cs="Arial"/>
                 <w:kern w:val="0"/>
                 <w:sz w:val="16"/>
                 <w:szCs w:val="16"/>
@@ -2209,12 +2371,15 @@
     </w:tbl>
     <w:p>
       <w:pPr>
-        <w:rPr>
-          <w:lang w:val="en-US"/>
-        </w:rPr>
-      </w:pPr>
-      <w:r>
-        <w:rPr>
+        <w:jc w:val="both"/>
+        <w:rPr>
+          <w:rFonts w:ascii="Arial" w:hAnsi="Arial" w:cs="Arial"/>
+          <w:lang w:val="en-US"/>
+        </w:rPr>
+      </w:pPr>
+      <w:r>
+        <w:rPr>
+          <w:rFonts w:ascii="Arial" w:hAnsi="Arial" w:cs="Arial"/>
           <w:noProof/>
           <w:lang w:val="en-US"/>
         </w:rPr>
@@ -2270,32 +2435,39 @@
     </w:p>
     <w:p>
       <w:pPr>
-        <w:rPr>
-          <w:b/>
-          <w:bCs/>
-          <w:lang w:val="en-US"/>
-        </w:rPr>
-      </w:pPr>
-    </w:p>
-    <w:p>
-      <w:pPr>
-        <w:rPr>
-          <w:b/>
-          <w:bCs/>
-          <w:lang w:val="en-US"/>
-        </w:rPr>
-      </w:pPr>
-    </w:p>
-    <w:p>
-      <w:pPr>
-        <w:rPr>
-          <w:b/>
-          <w:bCs/>
-          <w:lang w:val="en-US"/>
-        </w:rPr>
-      </w:pPr>
-      <w:r>
-        <w:rPr>
+        <w:jc w:val="both"/>
+        <w:rPr>
+          <w:rFonts w:ascii="Arial" w:hAnsi="Arial" w:cs="Arial"/>
+          <w:b/>
+          <w:bCs/>
+          <w:lang w:val="en-US"/>
+        </w:rPr>
+      </w:pPr>
+    </w:p>
+    <w:p>
+      <w:pPr>
+        <w:jc w:val="both"/>
+        <w:rPr>
+          <w:rFonts w:ascii="Arial" w:hAnsi="Arial" w:cs="Arial"/>
+          <w:b/>
+          <w:bCs/>
+          <w:lang w:val="en-US"/>
+        </w:rPr>
+      </w:pPr>
+    </w:p>
+    <w:p>
+      <w:pPr>
+        <w:jc w:val="both"/>
+        <w:rPr>
+          <w:rFonts w:ascii="Arial" w:hAnsi="Arial" w:cs="Arial"/>
+          <w:b/>
+          <w:bCs/>
+          <w:lang w:val="en-US"/>
+        </w:rPr>
+      </w:pPr>
+      <w:r>
+        <w:rPr>
+          <w:rFonts w:ascii="Arial" w:hAnsi="Arial" w:cs="Arial"/>
           <w:b/>
           <w:bCs/>
           <w:lang w:val="en-US"/>
@@ -2305,7 +2477,9 @@
     </w:p>
     <w:p>
       <w:pPr>
-        <w:rPr>
+        <w:jc w:val="both"/>
+        <w:rPr>
+          <w:rFonts w:ascii="Arial" w:hAnsi="Arial" w:cs="Arial"/>
           <w:lang w:val="en-US"/>
         </w:rPr>
       </w:pPr>
@@ -2317,14 +2491,17 @@
           <w:ilvl w:val="0"/>
           <w:numId w:val="15"/>
         </w:numPr>
-        <w:rPr>
-          <w:b/>
-          <w:bCs/>
-          <w:lang w:val="en-US"/>
-        </w:rPr>
-      </w:pPr>
-      <w:r>
-        <w:rPr>
+        <w:jc w:val="both"/>
+        <w:rPr>
+          <w:rFonts w:ascii="Arial" w:hAnsi="Arial" w:cs="Arial"/>
+          <w:b/>
+          <w:bCs/>
+          <w:lang w:val="en-US"/>
+        </w:rPr>
+      </w:pPr>
+      <w:r>
+        <w:rPr>
+          <w:rFonts w:ascii="Arial" w:hAnsi="Arial" w:cs="Arial"/>
           <w:b/>
           <w:bCs/>
           <w:lang w:val="en-US"/>
@@ -2335,14 +2512,17 @@
     <w:p>
       <w:pPr>
         <w:pStyle w:val="Prrafodelista"/>
-        <w:rPr>
-          <w:b/>
-          <w:bCs/>
-          <w:lang w:val="en-US"/>
-        </w:rPr>
-      </w:pPr>
-      <w:r>
-        <w:rPr>
+        <w:jc w:val="both"/>
+        <w:rPr>
+          <w:rFonts w:ascii="Arial" w:hAnsi="Arial" w:cs="Arial"/>
+          <w:b/>
+          <w:bCs/>
+          <w:lang w:val="en-US"/>
+        </w:rPr>
+      </w:pPr>
+      <w:r>
+        <w:rPr>
+          <w:rFonts w:ascii="Arial" w:hAnsi="Arial" w:cs="Arial"/>
           <w:b/>
           <w:bCs/>
           <w:lang w:val="en-US"/>
@@ -2352,6 +2532,7 @@
       <w:proofErr w:type="spellStart"/>
       <w:r>
         <w:rPr>
+          <w:rFonts w:ascii="Arial" w:hAnsi="Arial" w:cs="Arial"/>
           <w:b/>
           <w:bCs/>
           <w:lang w:val="en-US"/>
@@ -2361,6 +2542,7 @@
       <w:proofErr w:type="spellEnd"/>
       <w:r>
         <w:rPr>
+          <w:rFonts w:ascii="Arial" w:hAnsi="Arial" w:cs="Arial"/>
           <w:b/>
           <w:bCs/>
           <w:lang w:val="en-US"/>
@@ -2370,12 +2552,15 @@
     </w:p>
     <w:p>
       <w:pPr>
-        <w:rPr>
-          <w:lang w:val="en-US"/>
-        </w:rPr>
-      </w:pPr>
-      <w:r>
-        <w:rPr>
+        <w:jc w:val="both"/>
+        <w:rPr>
+          <w:rFonts w:ascii="Arial" w:hAnsi="Arial" w:cs="Arial"/>
+          <w:lang w:val="en-US"/>
+        </w:rPr>
+      </w:pPr>
+      <w:r>
+        <w:rPr>
+          <w:rFonts w:ascii="Arial" w:hAnsi="Arial" w:cs="Arial"/>
           <w:b/>
           <w:bCs/>
           <w:lang w:val="en-US"/>
@@ -2389,12 +2574,15 @@
           <w:ilvl w:val="0"/>
           <w:numId w:val="7"/>
         </w:numPr>
-        <w:rPr>
-          <w:lang w:val="en-US"/>
-        </w:rPr>
-      </w:pPr>
-      <w:r>
-        <w:rPr>
+        <w:jc w:val="both"/>
+        <w:rPr>
+          <w:rFonts w:ascii="Arial" w:hAnsi="Arial" w:cs="Arial"/>
+          <w:lang w:val="en-US"/>
+        </w:rPr>
+      </w:pPr>
+      <w:r>
+        <w:rPr>
+          <w:rFonts w:ascii="Arial" w:hAnsi="Arial" w:cs="Arial"/>
           <w:b/>
           <w:bCs/>
           <w:lang w:val="en-US"/>
@@ -2403,6 +2591,7 @@
       </w:r>
       <w:r>
         <w:rPr>
+          <w:rFonts w:ascii="Arial" w:hAnsi="Arial" w:cs="Arial"/>
           <w:lang w:val="en-US"/>
         </w:rPr>
         <w:t xml:space="preserve"> Isolate business logic from infrastructure frameworks. The core domain should not know about HTTP clients, </w:t>
@@ -2410,6 +2599,7 @@
       <w:proofErr w:type="spellStart"/>
       <w:r>
         <w:rPr>
+          <w:rFonts w:ascii="Arial" w:hAnsi="Arial" w:cs="Arial"/>
           <w:lang w:val="en-US"/>
         </w:rPr>
         <w:t>OpenTelemetry</w:t>
@@ -2417,6 +2607,7 @@
       <w:proofErr w:type="spellEnd"/>
       <w:r>
         <w:rPr>
+          <w:rFonts w:ascii="Arial" w:hAnsi="Arial" w:cs="Arial"/>
           <w:lang w:val="en-US"/>
         </w:rPr>
         <w:t>, or Resilience4j.</w:t>
@@ -2428,12 +2619,15 @@
           <w:ilvl w:val="0"/>
           <w:numId w:val="7"/>
         </w:numPr>
-        <w:rPr>
-          <w:lang w:val="en-US"/>
-        </w:rPr>
-      </w:pPr>
-      <w:r>
-        <w:rPr>
+        <w:jc w:val="both"/>
+        <w:rPr>
+          <w:rFonts w:ascii="Arial" w:hAnsi="Arial" w:cs="Arial"/>
+          <w:lang w:val="en-US"/>
+        </w:rPr>
+      </w:pPr>
+      <w:r>
+        <w:rPr>
+          <w:rFonts w:ascii="Arial" w:hAnsi="Arial" w:cs="Arial"/>
           <w:b/>
           <w:bCs/>
           <w:lang w:val="en-US"/>
@@ -2442,6 +2636,7 @@
       </w:r>
       <w:r>
         <w:rPr>
+          <w:rFonts w:ascii="Arial" w:hAnsi="Arial" w:cs="Arial"/>
           <w:lang w:val="en-US"/>
         </w:rPr>
         <w:t> We define an interface (</w:t>
@@ -2449,6 +2644,7 @@
       <w:proofErr w:type="spellStart"/>
       <w:r>
         <w:rPr>
+          <w:rFonts w:ascii="Arial" w:hAnsi="Arial" w:cs="Arial"/>
           <w:lang w:val="en-US"/>
         </w:rPr>
         <w:t>IntegrationPort</w:t>
@@ -2456,12 +2652,14 @@
       <w:proofErr w:type="spellEnd"/>
       <w:r>
         <w:rPr>
+          <w:rFonts w:ascii="Arial" w:hAnsi="Arial" w:cs="Arial"/>
           <w:lang w:val="en-US"/>
         </w:rPr>
         <w:t>) in the </w:t>
       </w:r>
       <w:r>
         <w:rPr>
+          <w:rFonts w:ascii="Arial" w:hAnsi="Arial" w:cs="Arial"/>
           <w:b/>
           <w:bCs/>
           <w:lang w:val="en-US"/>
@@ -2470,6 +2668,7 @@
       </w:r>
       <w:r>
         <w:rPr>
+          <w:rFonts w:ascii="Arial" w:hAnsi="Arial" w:cs="Arial"/>
           <w:lang w:val="en-US"/>
         </w:rPr>
         <w:t>. The actual integration component (</w:t>
@@ -2477,6 +2676,7 @@
       <w:proofErr w:type="spellStart"/>
       <w:r>
         <w:rPr>
+          <w:rFonts w:ascii="Arial" w:hAnsi="Arial" w:cs="Arial"/>
           <w:lang w:val="en-US"/>
         </w:rPr>
         <w:t>ResilientIntegrationAdapter</w:t>
@@ -2484,12 +2684,14 @@
       <w:proofErr w:type="spellEnd"/>
       <w:r>
         <w:rPr>
+          <w:rFonts w:ascii="Arial" w:hAnsi="Arial" w:cs="Arial"/>
           <w:lang w:val="en-US"/>
         </w:rPr>
         <w:t>) sits in the </w:t>
       </w:r>
       <w:r>
         <w:rPr>
+          <w:rFonts w:ascii="Arial" w:hAnsi="Arial" w:cs="Arial"/>
           <w:b/>
           <w:bCs/>
           <w:lang w:val="en-US"/>
@@ -2498,6 +2700,7 @@
       </w:r>
       <w:r>
         <w:rPr>
+          <w:rFonts w:ascii="Arial" w:hAnsi="Arial" w:cs="Arial"/>
           <w:b/>
           <w:bCs/>
           <w:lang w:val="en-US"/>
@@ -2506,6 +2709,7 @@
       </w:r>
       <w:r>
         <w:rPr>
+          <w:rFonts w:ascii="Arial" w:hAnsi="Arial" w:cs="Arial"/>
           <w:lang w:val="en-US"/>
         </w:rPr>
         <w:t> and implements this interface.</w:t>
@@ -2513,12 +2717,15 @@
     </w:p>
     <w:p>
       <w:pPr>
-        <w:rPr>
-          <w:lang w:val="en-US"/>
-        </w:rPr>
-      </w:pPr>
-      <w:r>
-        <w:rPr>
+        <w:jc w:val="both"/>
+        <w:rPr>
+          <w:rFonts w:ascii="Arial" w:hAnsi="Arial" w:cs="Arial"/>
+          <w:lang w:val="en-US"/>
+        </w:rPr>
+      </w:pPr>
+      <w:r>
+        <w:rPr>
+          <w:rFonts w:ascii="Arial" w:hAnsi="Arial" w:cs="Arial"/>
           <w:b/>
           <w:bCs/>
           <w:lang w:val="en-US"/>
@@ -2532,12 +2739,15 @@
           <w:ilvl w:val="0"/>
           <w:numId w:val="8"/>
         </w:numPr>
-        <w:rPr>
-          <w:lang w:val="en-US"/>
-        </w:rPr>
-      </w:pPr>
-      <w:r>
-        <w:rPr>
+        <w:jc w:val="both"/>
+        <w:rPr>
+          <w:rFonts w:ascii="Arial" w:hAnsi="Arial" w:cs="Arial"/>
+          <w:lang w:val="en-US"/>
+        </w:rPr>
+      </w:pPr>
+      <w:r>
+        <w:rPr>
+          <w:rFonts w:ascii="Arial" w:hAnsi="Arial" w:cs="Arial"/>
           <w:b/>
           <w:bCs/>
           <w:lang w:val="en-US"/>
@@ -2546,12 +2756,14 @@
       </w:r>
       <w:r>
         <w:rPr>
+          <w:rFonts w:ascii="Arial" w:hAnsi="Arial" w:cs="Arial"/>
           <w:lang w:val="en-US"/>
         </w:rPr>
         <w:t> Use </w:t>
       </w:r>
       <w:r>
         <w:rPr>
+          <w:rFonts w:ascii="Arial" w:hAnsi="Arial" w:cs="Arial"/>
           <w:b/>
           <w:bCs/>
           <w:lang w:val="en-US"/>
@@ -2560,6 +2772,7 @@
       </w:r>
       <w:r>
         <w:rPr>
+          <w:rFonts w:ascii="Arial" w:hAnsi="Arial" w:cs="Arial"/>
           <w:lang w:val="en-US"/>
         </w:rPr>
         <w:t>, which is the standard fault-tolerance library for Spring Boot 3.x.</w:t>
@@ -2571,12 +2784,15 @@
           <w:ilvl w:val="0"/>
           <w:numId w:val="8"/>
         </w:numPr>
-        <w:rPr>
-          <w:lang w:val="en-US"/>
-        </w:rPr>
-      </w:pPr>
-      <w:r>
-        <w:rPr>
+        <w:jc w:val="both"/>
+        <w:rPr>
+          <w:rFonts w:ascii="Arial" w:hAnsi="Arial" w:cs="Arial"/>
+          <w:lang w:val="en-US"/>
+        </w:rPr>
+      </w:pPr>
+      <w:r>
+        <w:rPr>
+          <w:rFonts w:ascii="Arial" w:hAnsi="Arial" w:cs="Arial"/>
           <w:b/>
           <w:bCs/>
           <w:lang w:val="en-US"/>
@@ -2585,6 +2801,7 @@
       </w:r>
       <w:r>
         <w:rPr>
+          <w:rFonts w:ascii="Arial" w:hAnsi="Arial" w:cs="Arial"/>
           <w:lang w:val="en-US"/>
         </w:rPr>
         <w:t> We configure a </w:t>
@@ -2592,6 +2809,7 @@
       <w:proofErr w:type="spellStart"/>
       <w:r>
         <w:rPr>
+          <w:rFonts w:ascii="Arial" w:hAnsi="Arial" w:cs="Arial"/>
           <w:lang w:val="en-US"/>
         </w:rPr>
         <w:t>CircuitBreaker</w:t>
@@ -2599,6 +2817,7 @@
       <w:proofErr w:type="spellEnd"/>
       <w:r>
         <w:rPr>
+          <w:rFonts w:ascii="Arial" w:hAnsi="Arial" w:cs="Arial"/>
           <w:lang w:val="en-US"/>
         </w:rPr>
         <w:t> (to fail fast if the external system goes down), a Retry (with exponential backoff and randomized jitter to prevent thundering herd scenarios), and a </w:t>
@@ -2606,6 +2825,7 @@
       <w:proofErr w:type="spellStart"/>
       <w:r>
         <w:rPr>
+          <w:rFonts w:ascii="Arial" w:hAnsi="Arial" w:cs="Arial"/>
           <w:lang w:val="en-US"/>
         </w:rPr>
         <w:t>TimeLimiter</w:t>
@@ -2613,15 +2833,23 @@
       <w:proofErr w:type="spellEnd"/>
       <w:r>
         <w:rPr>
+          <w:rFonts w:ascii="Arial" w:hAnsi="Arial" w:cs="Arial"/>
           <w:lang w:val="en-US"/>
         </w:rPr>
         <w:t> (to prevent hanging threads).</w:t>
       </w:r>
     </w:p>
     <w:p>
+      <w:pPr>
+        <w:jc w:val="both"/>
+        <w:rPr>
+          <w:rFonts w:ascii="Arial" w:hAnsi="Arial" w:cs="Arial"/>
+        </w:rPr>
+      </w:pPr>
       <w:proofErr w:type="spellStart"/>
       <w:r>
         <w:rPr>
+          <w:rFonts w:ascii="Arial" w:hAnsi="Arial" w:cs="Arial"/>
           <w:b/>
           <w:bCs/>
         </w:rPr>
@@ -2630,6 +2858,7 @@
       <w:proofErr w:type="spellEnd"/>
       <w:r>
         <w:rPr>
+          <w:rFonts w:ascii="Arial" w:hAnsi="Arial" w:cs="Arial"/>
           <w:b/>
           <w:bCs/>
         </w:rPr>
@@ -2638,6 +2867,7 @@
       <w:proofErr w:type="spellStart"/>
       <w:r>
         <w:rPr>
+          <w:rFonts w:ascii="Arial" w:hAnsi="Arial" w:cs="Arial"/>
           <w:b/>
           <w:bCs/>
         </w:rPr>
@@ -2646,6 +2876,7 @@
       <w:proofErr w:type="spellEnd"/>
       <w:r>
         <w:rPr>
+          <w:rFonts w:ascii="Arial" w:hAnsi="Arial" w:cs="Arial"/>
           <w:b/>
           <w:bCs/>
         </w:rPr>
@@ -2654,6 +2885,7 @@
       <w:proofErr w:type="spellStart"/>
       <w:r>
         <w:rPr>
+          <w:rFonts w:ascii="Arial" w:hAnsi="Arial" w:cs="Arial"/>
           <w:b/>
           <w:bCs/>
         </w:rPr>
@@ -2662,6 +2894,7 @@
       <w:proofErr w:type="spellEnd"/>
       <w:r>
         <w:rPr>
+          <w:rFonts w:ascii="Arial" w:hAnsi="Arial" w:cs="Arial"/>
           <w:b/>
           <w:bCs/>
         </w:rPr>
@@ -2674,12 +2907,15 @@
           <w:ilvl w:val="0"/>
           <w:numId w:val="9"/>
         </w:numPr>
-        <w:rPr>
-          <w:lang w:val="en-US"/>
-        </w:rPr>
-      </w:pPr>
-      <w:r>
-        <w:rPr>
+        <w:jc w:val="both"/>
+        <w:rPr>
+          <w:rFonts w:ascii="Arial" w:hAnsi="Arial" w:cs="Arial"/>
+          <w:lang w:val="en-US"/>
+        </w:rPr>
+      </w:pPr>
+      <w:r>
+        <w:rPr>
+          <w:rFonts w:ascii="Arial" w:hAnsi="Arial" w:cs="Arial"/>
           <w:b/>
           <w:bCs/>
           <w:lang w:val="en-US"/>
@@ -2688,12 +2924,14 @@
       </w:r>
       <w:r>
         <w:rPr>
+          <w:rFonts w:ascii="Arial" w:hAnsi="Arial" w:cs="Arial"/>
           <w:lang w:val="en-US"/>
         </w:rPr>
         <w:t> Use </w:t>
       </w:r>
       <w:r>
         <w:rPr>
+          <w:rFonts w:ascii="Arial" w:hAnsi="Arial" w:cs="Arial"/>
           <w:b/>
           <w:bCs/>
           <w:lang w:val="en-US"/>
@@ -2702,6 +2940,7 @@
       </w:r>
       <w:r>
         <w:rPr>
+          <w:rFonts w:ascii="Arial" w:hAnsi="Arial" w:cs="Arial"/>
           <w:lang w:val="en-US"/>
         </w:rPr>
         <w:t xml:space="preserve"> with an </w:t>
@@ -2709,6 +2948,7 @@
       <w:proofErr w:type="spellStart"/>
       <w:r>
         <w:rPr>
+          <w:rFonts w:ascii="Arial" w:hAnsi="Arial" w:cs="Arial"/>
           <w:lang w:val="en-US"/>
         </w:rPr>
         <w:t>OpenTelemetry</w:t>
@@ -2716,6 +2956,7 @@
       <w:proofErr w:type="spellEnd"/>
       <w:r>
         <w:rPr>
+          <w:rFonts w:ascii="Arial" w:hAnsi="Arial" w:cs="Arial"/>
           <w:lang w:val="en-US"/>
         </w:rPr>
         <w:t xml:space="preserve"> (</w:t>
@@ -2723,6 +2964,7 @@
       <w:proofErr w:type="spellStart"/>
       <w:r>
         <w:rPr>
+          <w:rFonts w:ascii="Arial" w:hAnsi="Arial" w:cs="Arial"/>
           <w:lang w:val="en-US"/>
         </w:rPr>
         <w:t>OTel</w:t>
@@ -2730,6 +2972,7 @@
       <w:proofErr w:type="spellEnd"/>
       <w:r>
         <w:rPr>
+          <w:rFonts w:ascii="Arial" w:hAnsi="Arial" w:cs="Arial"/>
           <w:lang w:val="en-US"/>
         </w:rPr>
         <w:t>) bridge.</w:t>
@@ -2741,12 +2984,15 @@
           <w:ilvl w:val="0"/>
           <w:numId w:val="9"/>
         </w:numPr>
-        <w:rPr>
-          <w:lang w:val="en-US"/>
-        </w:rPr>
-      </w:pPr>
-      <w:r>
-        <w:rPr>
+        <w:jc w:val="both"/>
+        <w:rPr>
+          <w:rFonts w:ascii="Arial" w:hAnsi="Arial" w:cs="Arial"/>
+          <w:lang w:val="en-US"/>
+        </w:rPr>
+      </w:pPr>
+      <w:r>
+        <w:rPr>
+          <w:rFonts w:ascii="Arial" w:hAnsi="Arial" w:cs="Arial"/>
           <w:b/>
           <w:bCs/>
           <w:lang w:val="en-US"/>
@@ -2755,6 +3001,7 @@
       </w:r>
       <w:r>
         <w:rPr>
+          <w:rFonts w:ascii="Arial" w:hAnsi="Arial" w:cs="Arial"/>
           <w:lang w:val="en-US"/>
         </w:rPr>
         <w:t xml:space="preserve"> Spring Boot 3 natively supports Micrometer. By adding the </w:t>
@@ -2762,6 +3009,7 @@
       <w:proofErr w:type="spellStart"/>
       <w:r>
         <w:rPr>
+          <w:rFonts w:ascii="Arial" w:hAnsi="Arial" w:cs="Arial"/>
           <w:lang w:val="en-US"/>
         </w:rPr>
         <w:t>OTel</w:t>
@@ -2769,6 +3017,7 @@
       <w:proofErr w:type="spellEnd"/>
       <w:r>
         <w:rPr>
+          <w:rFonts w:ascii="Arial" w:hAnsi="Arial" w:cs="Arial"/>
           <w:lang w:val="en-US"/>
         </w:rPr>
         <w:t xml:space="preserve"> bridge, Spring automatically intercepts incoming and outgoing HTTP requests (via </w:t>
@@ -2776,6 +3025,7 @@
       <w:proofErr w:type="spellStart"/>
       <w:r>
         <w:rPr>
+          <w:rFonts w:ascii="Arial" w:hAnsi="Arial" w:cs="Arial"/>
           <w:lang w:val="en-US"/>
         </w:rPr>
         <w:t>RestClient</w:t>
@@ -2783,6 +3033,7 @@
       <w:proofErr w:type="spellEnd"/>
       <w:r>
         <w:rPr>
+          <w:rFonts w:ascii="Arial" w:hAnsi="Arial" w:cs="Arial"/>
           <w:lang w:val="en-US"/>
         </w:rPr>
         <w:t>), injecting </w:t>
@@ -2790,6 +3041,7 @@
       <w:proofErr w:type="spellStart"/>
       <w:r>
         <w:rPr>
+          <w:rFonts w:ascii="Arial" w:hAnsi="Arial" w:cs="Arial"/>
           <w:lang w:val="en-US"/>
         </w:rPr>
         <w:t>traceId</w:t>
@@ -2797,6 +3049,7 @@
       <w:proofErr w:type="spellEnd"/>
       <w:r>
         <w:rPr>
+          <w:rFonts w:ascii="Arial" w:hAnsi="Arial" w:cs="Arial"/>
           <w:lang w:val="en-US"/>
         </w:rPr>
         <w:t> and </w:t>
@@ -2804,6 +3057,7 @@
       <w:proofErr w:type="spellStart"/>
       <w:r>
         <w:rPr>
+          <w:rFonts w:ascii="Arial" w:hAnsi="Arial" w:cs="Arial"/>
           <w:lang w:val="en-US"/>
         </w:rPr>
         <w:t>spanId</w:t>
@@ -2811,6 +3065,7 @@
       <w:proofErr w:type="spellEnd"/>
       <w:r>
         <w:rPr>
+          <w:rFonts w:ascii="Arial" w:hAnsi="Arial" w:cs="Arial"/>
           <w:lang w:val="en-US"/>
         </w:rPr>
         <w:t> into the SLF4J MDC (Mapped Diagnostic Context) for unified logging, and propagating the </w:t>
@@ -2818,6 +3073,7 @@
       <w:proofErr w:type="spellStart"/>
       <w:r>
         <w:rPr>
+          <w:rFonts w:ascii="Arial" w:hAnsi="Arial" w:cs="Arial"/>
           <w:lang w:val="en-US"/>
         </w:rPr>
         <w:t>traceparent</w:t>
@@ -2825,15 +3081,23 @@
       <w:proofErr w:type="spellEnd"/>
       <w:r>
         <w:rPr>
+          <w:rFonts w:ascii="Arial" w:hAnsi="Arial" w:cs="Arial"/>
           <w:lang w:val="en-US"/>
         </w:rPr>
         <w:t> header to downstream services.</w:t>
       </w:r>
     </w:p>
     <w:p>
+      <w:pPr>
+        <w:jc w:val="both"/>
+        <w:rPr>
+          <w:rFonts w:ascii="Arial" w:hAnsi="Arial" w:cs="Arial"/>
+        </w:rPr>
+      </w:pPr>
       <w:proofErr w:type="spellStart"/>
       <w:r>
         <w:rPr>
+          <w:rFonts w:ascii="Arial" w:hAnsi="Arial" w:cs="Arial"/>
           <w:b/>
           <w:bCs/>
         </w:rPr>
@@ -2847,12 +3111,15 @@
           <w:ilvl w:val="0"/>
           <w:numId w:val="10"/>
         </w:numPr>
-        <w:rPr>
-          <w:lang w:val="en-US"/>
-        </w:rPr>
-      </w:pPr>
-      <w:r>
-        <w:rPr>
+        <w:jc w:val="both"/>
+        <w:rPr>
+          <w:rFonts w:ascii="Arial" w:hAnsi="Arial" w:cs="Arial"/>
+          <w:lang w:val="en-US"/>
+        </w:rPr>
+      </w:pPr>
+      <w:r>
+        <w:rPr>
+          <w:rFonts w:ascii="Arial" w:hAnsi="Arial" w:cs="Arial"/>
           <w:b/>
           <w:bCs/>
           <w:lang w:val="en-US"/>
@@ -2861,6 +3128,7 @@
       </w:r>
       <w:r>
         <w:rPr>
+          <w:rFonts w:ascii="Arial" w:hAnsi="Arial" w:cs="Arial"/>
           <w:lang w:val="en-US"/>
         </w:rPr>
         <w:t> Idempotency must be managed safely across retries to prevent duplicate processing on the external system.</w:t>
@@ -2872,43 +3140,59 @@
           <w:ilvl w:val="0"/>
           <w:numId w:val="10"/>
         </w:numPr>
-        <w:rPr>
-          <w:lang w:val="en-US"/>
-        </w:rPr>
-      </w:pPr>
-      <w:r>
-        <w:rPr>
-          <w:b/>
-          <w:bCs/>
+        <w:jc w:val="both"/>
+        <w:rPr>
+          <w:rFonts w:ascii="Arial" w:hAnsi="Arial" w:cs="Arial"/>
+          <w:lang w:val="en-US"/>
+        </w:rPr>
+      </w:pPr>
+      <w:r>
+        <w:rPr>
+          <w:rFonts w:ascii="Arial" w:hAnsi="Arial" w:cs="Arial"/>
+          <w:b/>
+          <w:bCs/>
+          <w:lang w:val="en-US"/>
+        </w:rPr>
+        <w:t>Implementation:</w:t>
+      </w:r>
+      <w:r>
+        <w:rPr>
+          <w:rFonts w:ascii="Arial" w:hAnsi="Arial" w:cs="Arial"/>
+          <w:lang w:val="en-US"/>
+        </w:rPr>
+        <w:t xml:space="preserve"> We enforce passing an Idempotency-Key (e.g., a UUID or a hash of the payload) via HTTP headers. Because we use Resilience4j </w:t>
+      </w:r>
+      <w:r>
+        <w:rPr>
+          <w:rFonts w:ascii="Arial" w:hAnsi="Arial" w:cs="Arial"/>
           <w:lang w:val="en-US"/>
         </w:rPr>
         <w:lastRenderedPageBreak/>
-        <w:t>Implementation:</w:t>
-      </w:r>
-      <w:r>
-        <w:rPr>
-          <w:lang w:val="en-US"/>
-        </w:rPr>
-        <w:t> We enforce passing an Idempotency-Key (e.g., a UUID or a hash of the payload) via HTTP headers. Because we use Resilience4j retries, keeping the exact same idempotency key for all retry attempts ensures the downstream system recognizes it as the same transaction.</w:t>
-      </w:r>
-    </w:p>
-    <w:p>
-      <w:pPr>
-        <w:rPr>
-          <w:lang w:val="en-US"/>
-        </w:rPr>
-      </w:pPr>
-    </w:p>
-    <w:p>
-      <w:pPr>
-        <w:rPr>
-          <w:b/>
-          <w:bCs/>
-          <w:lang w:val="en-US"/>
-        </w:rPr>
-      </w:pPr>
-      <w:r>
-        <w:rPr>
+        <w:t>retries, keeping the exact same idempotency key for all retry attempts ensures the downstream system recognizes it as the same transaction.</w:t>
+      </w:r>
+    </w:p>
+    <w:p>
+      <w:pPr>
+        <w:jc w:val="both"/>
+        <w:rPr>
+          <w:rFonts w:ascii="Arial" w:hAnsi="Arial" w:cs="Arial"/>
+          <w:lang w:val="en-US"/>
+        </w:rPr>
+      </w:pPr>
+    </w:p>
+    <w:p>
+      <w:pPr>
+        <w:jc w:val="both"/>
+        <w:rPr>
+          <w:rFonts w:ascii="Arial" w:hAnsi="Arial" w:cs="Arial"/>
+          <w:b/>
+          <w:bCs/>
+          <w:lang w:val="en-US"/>
+        </w:rPr>
+      </w:pPr>
+      <w:r>
+        <w:rPr>
+          <w:rFonts w:ascii="Arial" w:hAnsi="Arial" w:cs="Arial"/>
           <w:b/>
           <w:bCs/>
           <w:lang w:val="en-US"/>
@@ -2918,37 +3202,45 @@
     </w:p>
     <w:p>
       <w:pPr>
-        <w:rPr>
-          <w:lang w:val="en-US"/>
-        </w:rPr>
-      </w:pPr>
-    </w:p>
-    <w:p>
-      <w:pPr>
-        <w:rPr>
-          <w:lang w:val="en-US"/>
-        </w:rPr>
-      </w:pPr>
-      <w:r>
-        <w:rPr>
+        <w:jc w:val="both"/>
+        <w:rPr>
+          <w:rFonts w:ascii="Arial" w:hAnsi="Arial" w:cs="Arial"/>
+          <w:lang w:val="en-US"/>
+        </w:rPr>
+      </w:pPr>
+    </w:p>
+    <w:p>
+      <w:pPr>
+        <w:jc w:val="both"/>
+        <w:rPr>
+          <w:rFonts w:ascii="Arial" w:hAnsi="Arial" w:cs="Arial"/>
+          <w:lang w:val="en-US"/>
+        </w:rPr>
+      </w:pPr>
+      <w:r>
+        <w:rPr>
+          <w:rFonts w:ascii="Arial" w:hAnsi="Arial" w:cs="Arial"/>
           <w:lang w:val="en-US"/>
         </w:rPr>
         <w:t xml:space="preserve">This </w:t>
       </w:r>
       <w:r>
         <w:rPr>
+          <w:rFonts w:ascii="Arial" w:hAnsi="Arial" w:cs="Arial"/>
           <w:lang w:val="en-US"/>
         </w:rPr>
         <w:t xml:space="preserve">demo </w:t>
       </w:r>
       <w:r>
         <w:rPr>
+          <w:rFonts w:ascii="Arial" w:hAnsi="Arial" w:cs="Arial"/>
           <w:lang w:val="en-US"/>
         </w:rPr>
         <w:t xml:space="preserve">service demonstrates a </w:t>
       </w:r>
       <w:r>
         <w:rPr>
+          <w:rFonts w:ascii="Arial" w:hAnsi="Arial" w:cs="Arial"/>
           <w:b/>
           <w:bCs/>
           <w:lang w:val="en-US"/>
@@ -2957,6 +3249,7 @@
       </w:r>
       <w:r>
         <w:rPr>
+          <w:rFonts w:ascii="Arial" w:hAnsi="Arial" w:cs="Arial"/>
           <w:b/>
           <w:bCs/>
           <w:lang w:val="en-US"/>
@@ -2965,24 +3258,44 @@
       </w:r>
       <w:r>
         <w:rPr>
-          <w:lang w:val="en-US"/>
-        </w:rPr>
-        <w:t xml:space="preserve">integration framework with built-in resilience patterns </w:t>
-      </w:r>
-      <w:r>
-        <w:rPr>
-          <w:lang w:val="en-US"/>
-        </w:rPr>
-        <w:t xml:space="preserve">, </w:t>
-      </w:r>
-      <w:r>
-        <w:rPr>
-          <w:lang w:val="en-US"/>
-        </w:rPr>
-        <w:t xml:space="preserve">It includes a simulated </w:t>
-      </w:r>
-      <w:r>
-        <w:rPr>
+          <w:rFonts w:ascii="Arial" w:hAnsi="Arial" w:cs="Arial"/>
+          <w:lang w:val="en-US"/>
+        </w:rPr>
+        <w:t xml:space="preserve">integration framework with built-in resilience </w:t>
+      </w:r>
+      <w:r>
+        <w:rPr>
+          <w:rFonts w:ascii="Arial" w:hAnsi="Arial" w:cs="Arial"/>
+          <w:lang w:val="en-US"/>
+        </w:rPr>
+        <w:t>patterns,</w:t>
+      </w:r>
+      <w:r>
+        <w:rPr>
+          <w:rFonts w:ascii="Arial" w:hAnsi="Arial" w:cs="Arial"/>
+          <w:lang w:val="en-US"/>
+        </w:rPr>
+        <w:t xml:space="preserve"> </w:t>
+      </w:r>
+      <w:proofErr w:type="gramStart"/>
+      <w:r>
+        <w:rPr>
+          <w:rFonts w:ascii="Arial" w:hAnsi="Arial" w:cs="Arial"/>
+          <w:lang w:val="en-US"/>
+        </w:rPr>
+        <w:t>It</w:t>
+      </w:r>
+      <w:proofErr w:type="gramEnd"/>
+      <w:r>
+        <w:rPr>
+          <w:rFonts w:ascii="Arial" w:hAnsi="Arial" w:cs="Arial"/>
+          <w:lang w:val="en-US"/>
+        </w:rPr>
+        <w:t xml:space="preserve"> includes a simulated </w:t>
+      </w:r>
+      <w:r>
+        <w:rPr>
+          <w:rFonts w:ascii="Arial" w:hAnsi="Arial" w:cs="Arial"/>
           <w:b/>
           <w:bCs/>
           <w:lang w:val="en-US"/>
@@ -2991,6 +3304,7 @@
       </w:r>
       <w:r>
         <w:rPr>
+          <w:rFonts w:ascii="Arial" w:hAnsi="Arial" w:cs="Arial"/>
           <w:lang w:val="en-US"/>
         </w:rPr>
         <w:t xml:space="preserve"> that can be configured at runtime to produce failures and latency, allowing you to observe how the resilience mechanisms mitigate issues.</w:t>
@@ -2998,24 +3312,29 @@
     </w:p>
     <w:p>
       <w:pPr>
-        <w:rPr>
-          <w:lang w:val="en-US"/>
-        </w:rPr>
-      </w:pPr>
-      <w:r>
-        <w:rPr>
+        <w:jc w:val="both"/>
+        <w:rPr>
+          <w:rFonts w:ascii="Arial" w:hAnsi="Arial" w:cs="Arial"/>
+          <w:lang w:val="en-US"/>
+        </w:rPr>
+      </w:pPr>
+      <w:r>
+        <w:rPr>
+          <w:rFonts w:ascii="Arial" w:hAnsi="Arial" w:cs="Arial"/>
           <w:lang w:val="en-US"/>
         </w:rPr>
         <w:t xml:space="preserve">The scenarios to test </w:t>
       </w:r>
       <w:r>
         <w:rPr>
+          <w:rFonts w:ascii="Arial" w:hAnsi="Arial" w:cs="Arial"/>
           <w:lang w:val="en-US"/>
         </w:rPr>
         <w:t>are:</w:t>
       </w:r>
       <w:r>
         <w:rPr>
+          <w:rFonts w:ascii="Arial" w:hAnsi="Arial" w:cs="Arial"/>
           <w:lang w:val="en-US"/>
         </w:rPr>
         <w:t xml:space="preserve"> </w:t>
@@ -3028,12 +3347,15 @@
           <w:ilvl w:val="0"/>
           <w:numId w:val="10"/>
         </w:numPr>
-        <w:rPr>
-          <w:lang w:val="en-US"/>
-        </w:rPr>
-      </w:pPr>
-      <w:r>
-        <w:rPr>
+        <w:jc w:val="both"/>
+        <w:rPr>
+          <w:rFonts w:ascii="Arial" w:hAnsi="Arial" w:cs="Arial"/>
+          <w:lang w:val="en-US"/>
+        </w:rPr>
+      </w:pPr>
+      <w:r>
+        <w:rPr>
+          <w:rFonts w:ascii="Arial" w:hAnsi="Arial" w:cs="Arial"/>
           <w:lang w:val="en-US"/>
         </w:rPr>
         <w:t>Healthy Upstream (0% failure)</w:t>
@@ -3046,12 +3368,15 @@
           <w:ilvl w:val="0"/>
           <w:numId w:val="10"/>
         </w:numPr>
-        <w:rPr>
-          <w:lang w:val="en-US"/>
-        </w:rPr>
-      </w:pPr>
-      <w:r>
-        <w:rPr>
+        <w:jc w:val="both"/>
+        <w:rPr>
+          <w:rFonts w:ascii="Arial" w:hAnsi="Arial" w:cs="Arial"/>
+          <w:lang w:val="en-US"/>
+        </w:rPr>
+      </w:pPr>
+      <w:r>
+        <w:rPr>
+          <w:rFonts w:ascii="Arial" w:hAnsi="Arial" w:cs="Arial"/>
           <w:lang w:val="en-US"/>
         </w:rPr>
         <w:t>Flaky Upstream (60% failure) — Retry with Exponential Backoff + Jitter</w:t>
@@ -3064,12 +3389,15 @@
           <w:ilvl w:val="0"/>
           <w:numId w:val="10"/>
         </w:numPr>
-        <w:rPr>
-          <w:lang w:val="en-US"/>
-        </w:rPr>
-      </w:pPr>
-      <w:r>
-        <w:rPr>
+        <w:jc w:val="both"/>
+        <w:rPr>
+          <w:rFonts w:ascii="Arial" w:hAnsi="Arial" w:cs="Arial"/>
+          <w:lang w:val="en-US"/>
+        </w:rPr>
+      </w:pPr>
+      <w:r>
+        <w:rPr>
+          <w:rFonts w:ascii="Arial" w:hAnsi="Arial" w:cs="Arial"/>
           <w:lang w:val="en-US"/>
         </w:rPr>
         <w:t>Total Upstream Failure (100%) — Circuit Breaker Activation</w:t>
@@ -3082,12 +3410,15 @@
           <w:ilvl w:val="0"/>
           <w:numId w:val="10"/>
         </w:numPr>
-        <w:rPr>
-          <w:lang w:val="en-US"/>
-        </w:rPr>
-      </w:pPr>
-      <w:r>
-        <w:rPr>
+        <w:jc w:val="both"/>
+        <w:rPr>
+          <w:rFonts w:ascii="Arial" w:hAnsi="Arial" w:cs="Arial"/>
+          <w:lang w:val="en-US"/>
+        </w:rPr>
+      </w:pPr>
+      <w:r>
+        <w:rPr>
+          <w:rFonts w:ascii="Arial" w:hAnsi="Arial" w:cs="Arial"/>
           <w:lang w:val="en-US"/>
         </w:rPr>
         <w:t>Idempotency Key Support</w:t>
@@ -3100,12 +3431,15 @@
           <w:ilvl w:val="0"/>
           <w:numId w:val="10"/>
         </w:numPr>
-        <w:rPr>
-          <w:lang w:val="en-US"/>
-        </w:rPr>
-      </w:pPr>
-      <w:r>
-        <w:rPr>
+        <w:jc w:val="both"/>
+        <w:rPr>
+          <w:rFonts w:ascii="Arial" w:hAnsi="Arial" w:cs="Arial"/>
+          <w:lang w:val="en-US"/>
+        </w:rPr>
+      </w:pPr>
+      <w:r>
+        <w:rPr>
+          <w:rFonts w:ascii="Arial" w:hAnsi="Arial" w:cs="Arial"/>
           <w:lang w:val="en-US"/>
         </w:rPr>
         <w:t>Observability — Trace Propagation</w:t>
@@ -3113,24 +3447,29 @@
     </w:p>
     <w:p>
       <w:pPr>
-        <w:rPr>
-          <w:lang w:val="en-US"/>
-        </w:rPr>
-      </w:pPr>
-      <w:r>
-        <w:rPr>
+        <w:jc w:val="both"/>
+        <w:rPr>
+          <w:rFonts w:ascii="Arial" w:hAnsi="Arial" w:cs="Arial"/>
+          <w:lang w:val="en-US"/>
+        </w:rPr>
+      </w:pPr>
+      <w:r>
+        <w:rPr>
+          <w:rFonts w:ascii="Arial" w:hAnsi="Arial" w:cs="Arial"/>
           <w:lang w:val="en-US"/>
         </w:rPr>
         <w:t>For detail instruction</w:t>
       </w:r>
       <w:r>
         <w:rPr>
+          <w:rFonts w:ascii="Arial" w:hAnsi="Arial" w:cs="Arial"/>
           <w:lang w:val="en-US"/>
         </w:rPr>
         <w:t>s</w:t>
       </w:r>
       <w:r>
         <w:rPr>
+          <w:rFonts w:ascii="Arial" w:hAnsi="Arial" w:cs="Arial"/>
           <w:lang w:val="en-US"/>
         </w:rPr>
         <w:t xml:space="preserve"> refer to DEMO.md </w:t>
@@ -3138,173 +3477,175 @@
     </w:p>
     <w:p>
       <w:pPr>
-        <w:rPr>
-          <w:lang w:val="en-US"/>
-        </w:rPr>
-      </w:pPr>
-    </w:p>
-    <w:p>
-      <w:pPr>
-        <w:rPr>
-          <w:lang w:val="en-US"/>
-        </w:rPr>
-      </w:pPr>
-    </w:p>
-    <w:p>
-      <w:pPr>
-        <w:rPr>
-          <w:lang w:val="en-US"/>
-        </w:rPr>
-      </w:pPr>
-    </w:p>
-    <w:p>
-      <w:pPr>
-        <w:rPr>
-          <w:lang w:val="en-US"/>
-        </w:rPr>
-      </w:pPr>
-    </w:p>
-    <w:p>
-      <w:pPr>
-        <w:rPr>
-          <w:lang w:val="en-US"/>
-        </w:rPr>
-      </w:pPr>
-    </w:p>
-    <w:p>
-      <w:pPr>
-        <w:rPr>
-          <w:lang w:val="en-US"/>
-        </w:rPr>
-      </w:pPr>
-    </w:p>
-    <w:p>
-      <w:pPr>
-        <w:rPr>
-          <w:lang w:val="en-US"/>
-        </w:rPr>
-      </w:pPr>
-    </w:p>
-    <w:p>
-      <w:pPr>
-        <w:rPr>
-          <w:lang w:val="en-US"/>
-        </w:rPr>
-      </w:pPr>
-    </w:p>
-    <w:p>
-      <w:pPr>
-        <w:rPr>
-          <w:lang w:val="en-US"/>
-        </w:rPr>
-      </w:pPr>
-    </w:p>
-    <w:p>
-      <w:pPr>
-        <w:rPr>
-          <w:lang w:val="en-US"/>
-        </w:rPr>
-      </w:pPr>
-    </w:p>
-    <w:p>
-      <w:pPr>
-        <w:rPr>
-          <w:lang w:val="en-US"/>
-        </w:rPr>
-      </w:pPr>
-    </w:p>
-    <w:p>
-      <w:pPr>
-        <w:rPr>
-          <w:lang w:val="en-US"/>
-        </w:rPr>
-      </w:pPr>
-    </w:p>
-    <w:p>
-      <w:pPr>
-        <w:rPr>
-          <w:lang w:val="en-US"/>
-        </w:rPr>
-      </w:pPr>
-    </w:p>
-    <w:p>
-      <w:pPr>
-        <w:rPr>
-          <w:lang w:val="en-US"/>
-        </w:rPr>
-      </w:pPr>
-    </w:p>
-    <w:p>
-      <w:pPr>
-        <w:rPr>
-          <w:lang w:val="en-US"/>
-        </w:rPr>
-      </w:pPr>
-    </w:p>
-    <w:p>
-      <w:pPr>
-        <w:rPr>
-          <w:lang w:val="en-US"/>
-        </w:rPr>
-      </w:pPr>
-    </w:p>
-    <w:p>
-      <w:pPr>
-        <w:rPr>
-          <w:lang w:val="en-US"/>
-        </w:rPr>
-      </w:pPr>
-    </w:p>
-    <w:p>
-      <w:pPr>
-        <w:rPr>
-          <w:lang w:val="en-US"/>
-        </w:rPr>
-      </w:pPr>
-    </w:p>
-    <w:p>
-      <w:pPr>
-        <w:rPr>
-          <w:lang w:val="en-US"/>
-        </w:rPr>
-      </w:pPr>
-    </w:p>
-    <w:p>
-      <w:pPr>
-        <w:rPr>
-          <w:b/>
-          <w:bCs/>
-          <w:lang w:val="en-US"/>
-        </w:rPr>
-      </w:pPr>
-      <w:r>
-        <w:rPr>
-          <w:b/>
-          <w:bCs/>
-          <w:lang w:val="en-US"/>
-        </w:rPr>
+        <w:jc w:val="both"/>
+        <w:rPr>
+          <w:rFonts w:ascii="Arial" w:hAnsi="Arial" w:cs="Arial"/>
+          <w:lang w:val="en-US"/>
+        </w:rPr>
+      </w:pPr>
+    </w:p>
+    <w:p>
+      <w:pPr>
+        <w:jc w:val="both"/>
+        <w:rPr>
+          <w:rFonts w:ascii="Arial" w:hAnsi="Arial" w:cs="Arial"/>
+          <w:lang w:val="en-US"/>
+        </w:rPr>
+      </w:pPr>
+    </w:p>
+    <w:p>
+      <w:pPr>
+        <w:jc w:val="both"/>
+        <w:rPr>
+          <w:rFonts w:ascii="Arial" w:hAnsi="Arial" w:cs="Arial"/>
+          <w:lang w:val="en-US"/>
+        </w:rPr>
+      </w:pPr>
+    </w:p>
+    <w:p>
+      <w:pPr>
+        <w:jc w:val="both"/>
+        <w:rPr>
+          <w:rFonts w:ascii="Arial" w:hAnsi="Arial" w:cs="Arial"/>
+          <w:lang w:val="en-US"/>
+        </w:rPr>
+      </w:pPr>
+    </w:p>
+    <w:p>
+      <w:pPr>
+        <w:jc w:val="both"/>
+        <w:rPr>
+          <w:rFonts w:ascii="Arial" w:hAnsi="Arial" w:cs="Arial"/>
+          <w:lang w:val="en-US"/>
+        </w:rPr>
+      </w:pPr>
+    </w:p>
+    <w:p>
+      <w:pPr>
+        <w:jc w:val="both"/>
+        <w:rPr>
+          <w:rFonts w:ascii="Arial" w:hAnsi="Arial" w:cs="Arial"/>
+          <w:lang w:val="en-US"/>
+        </w:rPr>
+      </w:pPr>
+    </w:p>
+    <w:p>
+      <w:pPr>
+        <w:jc w:val="both"/>
+        <w:rPr>
+          <w:rFonts w:ascii="Arial" w:hAnsi="Arial" w:cs="Arial"/>
+          <w:lang w:val="en-US"/>
+        </w:rPr>
+      </w:pPr>
+    </w:p>
+    <w:p>
+      <w:pPr>
+        <w:jc w:val="both"/>
+        <w:rPr>
+          <w:rFonts w:ascii="Arial" w:hAnsi="Arial" w:cs="Arial"/>
+          <w:lang w:val="en-US"/>
+        </w:rPr>
+      </w:pPr>
+    </w:p>
+    <w:p>
+      <w:pPr>
+        <w:jc w:val="both"/>
+        <w:rPr>
+          <w:rFonts w:ascii="Arial" w:hAnsi="Arial" w:cs="Arial"/>
+          <w:lang w:val="en-US"/>
+        </w:rPr>
+      </w:pPr>
+    </w:p>
+    <w:p>
+      <w:pPr>
+        <w:jc w:val="both"/>
+        <w:rPr>
+          <w:rFonts w:ascii="Arial" w:hAnsi="Arial" w:cs="Arial"/>
+          <w:lang w:val="en-US"/>
+        </w:rPr>
+      </w:pPr>
+    </w:p>
+    <w:p>
+      <w:pPr>
+        <w:jc w:val="both"/>
+        <w:rPr>
+          <w:rFonts w:ascii="Arial" w:hAnsi="Arial" w:cs="Arial"/>
+          <w:lang w:val="en-US"/>
+        </w:rPr>
+      </w:pPr>
+    </w:p>
+    <w:p>
+      <w:pPr>
+        <w:jc w:val="both"/>
+        <w:rPr>
+          <w:rFonts w:ascii="Arial" w:hAnsi="Arial" w:cs="Arial"/>
+          <w:lang w:val="en-US"/>
+        </w:rPr>
+      </w:pPr>
+    </w:p>
+    <w:p>
+      <w:pPr>
+        <w:jc w:val="both"/>
+        <w:rPr>
+          <w:rFonts w:ascii="Arial" w:hAnsi="Arial" w:cs="Arial"/>
+          <w:lang w:val="en-US"/>
+        </w:rPr>
+      </w:pPr>
+    </w:p>
+    <w:p>
+      <w:pPr>
+        <w:jc w:val="both"/>
+        <w:rPr>
+          <w:rFonts w:ascii="Arial" w:hAnsi="Arial" w:cs="Arial"/>
+          <w:lang w:val="en-US"/>
+        </w:rPr>
+      </w:pPr>
+    </w:p>
+    <w:p>
+      <w:pPr>
+        <w:jc w:val="both"/>
+        <w:rPr>
+          <w:rFonts w:ascii="Arial" w:hAnsi="Arial" w:cs="Arial"/>
+          <w:b/>
+          <w:bCs/>
+          <w:lang w:val="en-US"/>
+        </w:rPr>
+      </w:pPr>
+      <w:r>
+        <w:rPr>
+          <w:rFonts w:ascii="Arial" w:hAnsi="Arial" w:cs="Arial"/>
+          <w:b/>
+          <w:bCs/>
+          <w:lang w:val="en-US"/>
+        </w:rPr>
+        <w:lastRenderedPageBreak/>
         <w:t>Section D – Technical Decision Record</w:t>
       </w:r>
     </w:p>
     <w:p>
       <w:pPr>
-        <w:rPr>
-          <w:b/>
-          <w:bCs/>
-          <w:lang w:val="en-US"/>
-        </w:rPr>
-      </w:pPr>
-    </w:p>
-    <w:p>
-      <w:pPr>
-        <w:rPr>
-          <w:b/>
-          <w:bCs/>
-          <w:lang w:val="en-US"/>
-        </w:rPr>
-      </w:pPr>
-      <w:r>
-        <w:rPr>
+        <w:jc w:val="both"/>
+        <w:rPr>
+          <w:rFonts w:ascii="Arial" w:hAnsi="Arial" w:cs="Arial"/>
+          <w:b/>
+          <w:bCs/>
+          <w:lang w:val="en-US"/>
+        </w:rPr>
+      </w:pPr>
+    </w:p>
+    <w:p>
+      <w:pPr>
+        <w:jc w:val="both"/>
+        <w:rPr>
+          <w:rFonts w:ascii="Arial" w:hAnsi="Arial" w:cs="Arial"/>
+          <w:b/>
+          <w:bCs/>
+          <w:lang w:val="en-US"/>
+        </w:rPr>
+      </w:pPr>
+      <w:r>
+        <w:rPr>
+          <w:rFonts w:ascii="Arial" w:hAnsi="Arial" w:cs="Arial"/>
           <w:b/>
           <w:bCs/>
           <w:lang w:val="en-US"/>
@@ -3314,12 +3655,15 @@
     </w:p>
     <w:p>
       <w:pPr>
-        <w:rPr>
-          <w:lang w:val="en-US"/>
-        </w:rPr>
-      </w:pPr>
-      <w:r>
-        <w:rPr>
+        <w:jc w:val="both"/>
+        <w:rPr>
+          <w:rFonts w:ascii="Arial" w:hAnsi="Arial" w:cs="Arial"/>
+          <w:lang w:val="en-US"/>
+        </w:rPr>
+      </w:pPr>
+      <w:r>
+        <w:rPr>
+          <w:rFonts w:ascii="Arial" w:hAnsi="Arial" w:cs="Arial"/>
           <w:b/>
           <w:bCs/>
           <w:lang w:val="en-US"/>
@@ -3328,6 +3672,7 @@
       </w:r>
       <w:r>
         <w:rPr>
+          <w:rFonts w:ascii="Arial" w:hAnsi="Arial" w:cs="Arial"/>
           <w:lang w:val="en-US"/>
         </w:rPr>
         <w:t xml:space="preserve"> Integration Strategy and Communication Patterns for Critical Flows</w:t>
@@ -3335,18 +3680,15 @@
     </w:p>
     <w:p>
       <w:pPr>
-        <w:rPr>
-          <w:lang w:val="en-US"/>
-        </w:rPr>
-      </w:pPr>
-      <w:r>
-        <w:rPr>
-          <w:lang w:val="en-US"/>
-        </w:rPr>
-        <w:t xml:space="preserve"> </w:t>
-      </w:r>
-      <w:r>
-        <w:rPr>
+        <w:jc w:val="both"/>
+        <w:rPr>
+          <w:rFonts w:ascii="Arial" w:hAnsi="Arial" w:cs="Arial"/>
+          <w:lang w:val="en-US"/>
+        </w:rPr>
+      </w:pPr>
+      <w:r>
+        <w:rPr>
+          <w:rFonts w:ascii="Arial" w:hAnsi="Arial" w:cs="Arial"/>
           <w:b/>
           <w:bCs/>
           <w:lang w:val="en-US"/>
@@ -3355,163 +3697,71 @@
       </w:r>
       <w:r>
         <w:rPr>
-          <w:lang w:val="en-US"/>
-        </w:rPr>
-        <w:t xml:space="preserve"> May 9, 2026</w:t>
-      </w:r>
-    </w:p>
-    <w:p>
-      <w:pPr>
-        <w:rPr>
-          <w:lang w:val="en-US"/>
-        </w:rPr>
-      </w:pPr>
-      <w:r>
-        <w:rPr>
-          <w:lang w:val="en-US"/>
-        </w:rPr>
-        <w:t xml:space="preserve"> </w:t>
-      </w:r>
-      <w:r>
-        <w:rPr>
-          <w:b/>
-          <w:bCs/>
-          <w:lang w:val="en-US"/>
-        </w:rPr>
-        <w:t>Status:</w:t>
-      </w:r>
-      <w:r>
-        <w:rPr>
-          <w:lang w:val="en-US"/>
-        </w:rPr>
-        <w:t xml:space="preserve"> Accepted</w:t>
-      </w:r>
-    </w:p>
-    <w:p>
-      <w:pPr>
-        <w:rPr>
-          <w:b/>
-          <w:bCs/>
-          <w:lang w:val="en-US"/>
-        </w:rPr>
-      </w:pPr>
-      <w:r>
-        <w:rPr>
-          <w:b/>
-          <w:bCs/>
-          <w:lang w:val="en-US"/>
-        </w:rPr>
-        <w:t>1. Context</w:t>
-      </w:r>
-    </w:p>
-    <w:p>
-      <w:pPr>
-        <w:rPr>
-          <w:lang w:val="en-US"/>
-        </w:rPr>
-      </w:pPr>
-      <w:r>
-        <w:rPr>
-          <w:lang w:val="en-US"/>
-        </w:rPr>
-        <w:t>As we scale our multi-country Digital Direct Channel, we face systemic bottlenecks in how we deliver and execute integrations. Currently, a single centralized middleware team handles all partner integrations, creating long lead times. Simultaneously, our critical flows (e.g., order processing, payment capture) rely heavily on synchronous service-to-service communication, making the platform vulnerable to cascading failures during high-traffic events or partial outages. We must establish a scalable target operating model for integration ownership and a resilient architectural pattern for critical transaction flows.</w:t>
-      </w:r>
-    </w:p>
-    <w:p>
-      <w:r>
+          <w:rFonts w:ascii="Arial" w:hAnsi="Arial" w:cs="Arial"/>
+          <w:lang w:val="en-US"/>
+        </w:rPr>
+        <w:t xml:space="preserve"> May </w:t>
+      </w:r>
+      <w:r>
+        <w:rPr>
+          <w:rFonts w:ascii="Arial" w:hAnsi="Arial" w:cs="Arial"/>
+          <w:lang w:val="en-US"/>
+        </w:rPr>
+        <w:t>10</w:t>
+      </w:r>
+      <w:r>
+        <w:rPr>
+          <w:rFonts w:ascii="Arial" w:hAnsi="Arial" w:cs="Arial"/>
+          <w:lang w:val="en-US"/>
+        </w:rPr>
+        <w:t>, 2026</w:t>
+      </w:r>
+    </w:p>
+    <w:p>
+      <w:pPr>
+        <w:jc w:val="both"/>
+        <w:rPr>
+          <w:rFonts w:ascii="Arial" w:hAnsi="Arial" w:cs="Arial"/>
+          <w:lang w:val="en-US"/>
+        </w:rPr>
+      </w:pPr>
+      <w:r>
+        <w:rPr>
+          <w:rFonts w:ascii="Arial" w:hAnsi="Arial" w:cs="Arial"/>
+        </w:rPr>
         <w:pict w14:anchorId="07727E0D">
           <v:rect id="_x0000_i1070" style="width:0;height:1.5pt" o:hralign="center" o:hrstd="t" o:hr="t" fillcolor="#a0a0a0" stroked="f"/>
         </w:pict>
       </w:r>
-    </w:p>
-    <w:p>
-      <w:pPr>
-        <w:rPr>
-          <w:b/>
-          <w:bCs/>
-        </w:rPr>
-      </w:pPr>
-      <w:r>
-        <w:rPr>
-          <w:b/>
-          <w:bCs/>
-        </w:rPr>
-        <w:t xml:space="preserve">2. </w:t>
-      </w:r>
-      <w:proofErr w:type="spellStart"/>
-      <w:r>
-        <w:rPr>
-          <w:b/>
-          <w:bCs/>
-        </w:rPr>
-        <w:t>Decision</w:t>
-      </w:r>
-      <w:proofErr w:type="spellEnd"/>
-      <w:r>
-        <w:rPr>
-          <w:b/>
-          <w:bCs/>
-        </w:rPr>
-        <w:t xml:space="preserve"> 1: </w:t>
-      </w:r>
-      <w:proofErr w:type="spellStart"/>
-      <w:r>
-        <w:rPr>
-          <w:b/>
-          <w:bCs/>
-        </w:rPr>
-        <w:t>Integration</w:t>
-      </w:r>
-      <w:proofErr w:type="spellEnd"/>
-      <w:r>
-        <w:rPr>
-          <w:b/>
-          <w:bCs/>
-        </w:rPr>
-        <w:t xml:space="preserve"> </w:t>
-      </w:r>
-      <w:proofErr w:type="spellStart"/>
-      <w:r>
-        <w:rPr>
-          <w:b/>
-          <w:bCs/>
-        </w:rPr>
-        <w:t>Platform</w:t>
-      </w:r>
-      <w:proofErr w:type="spellEnd"/>
-      <w:r>
-        <w:rPr>
-          <w:b/>
-          <w:bCs/>
-        </w:rPr>
-        <w:t xml:space="preserve"> </w:t>
-      </w:r>
-      <w:proofErr w:type="spellStart"/>
-      <w:r>
-        <w:rPr>
-          <w:b/>
-          <w:bCs/>
-        </w:rPr>
-        <w:t>Ownership</w:t>
-      </w:r>
-      <w:proofErr w:type="spellEnd"/>
-    </w:p>
-    <w:p>
-      <w:pPr>
-        <w:rPr>
-          <w:b/>
-          <w:bCs/>
-        </w:rPr>
-      </w:pPr>
-      <w:proofErr w:type="spellStart"/>
-      <w:r>
-        <w:rPr>
-          <w:b/>
-          <w:bCs/>
+      <w:r>
+        <w:rPr>
+          <w:rFonts w:ascii="Arial" w:hAnsi="Arial" w:cs="Arial"/>
+          <w:b/>
+          <w:bCs/>
+          <w:lang w:val="en-US"/>
+        </w:rPr>
+        <w:t xml:space="preserve"> Decision 1: Integration Platform Ownership</w:t>
+      </w:r>
+    </w:p>
+    <w:p>
+      <w:pPr>
+        <w:jc w:val="both"/>
+        <w:rPr>
+          <w:rFonts w:ascii="Arial" w:hAnsi="Arial" w:cs="Arial"/>
+          <w:b/>
+          <w:bCs/>
+          <w:lang w:val="en-US"/>
+        </w:rPr>
+      </w:pPr>
+      <w:r>
+        <w:rPr>
+          <w:rFonts w:ascii="Arial" w:hAnsi="Arial" w:cs="Arial"/>
+          <w:b/>
+          <w:bCs/>
+          <w:lang w:val="en-US"/>
         </w:rPr>
         <w:t>Options</w:t>
       </w:r>
-      <w:proofErr w:type="spellEnd"/>
     </w:p>
     <w:p>
       <w:pPr>
@@ -3519,12 +3769,15 @@
           <w:ilvl w:val="0"/>
           <w:numId w:val="11"/>
         </w:numPr>
-        <w:rPr>
-          <w:lang w:val="en-US"/>
-        </w:rPr>
-      </w:pPr>
-      <w:r>
-        <w:rPr>
+        <w:jc w:val="both"/>
+        <w:rPr>
+          <w:rFonts w:ascii="Arial" w:hAnsi="Arial" w:cs="Arial"/>
+          <w:lang w:val="en-US"/>
+        </w:rPr>
+      </w:pPr>
+      <w:r>
+        <w:rPr>
+          <w:rFonts w:ascii="Arial" w:hAnsi="Arial" w:cs="Arial"/>
           <w:b/>
           <w:bCs/>
           <w:lang w:val="en-US"/>
@@ -3533,16 +3786,10 @@
       </w:r>
       <w:r>
         <w:rPr>
-          <w:lang w:val="en-US"/>
-        </w:rPr>
-        <w:t xml:space="preserve"> A dedicated integration team owns a centralized Enterprise Service Bus (ESB) or centralized API Gateway. </w:t>
-      </w:r>
-      <w:r>
-        <w:rPr>
-          <w:lang w:val="en-US"/>
-        </w:rPr>
-        <w:lastRenderedPageBreak/>
-        <w:t>They build, deploy, and maintain all routing, transformation, and integration logic.</w:t>
+          <w:rFonts w:ascii="Arial" w:hAnsi="Arial" w:cs="Arial"/>
+          <w:lang w:val="en-US"/>
+        </w:rPr>
+        <w:t xml:space="preserve"> A dedicated integration team owns a centralized Enterprise Service Bus (ESB) or centralized API Gateway. They build, deploy, and maintain all routing, transformation, and integration logic.</w:t>
       </w:r>
     </w:p>
     <w:p>
@@ -3551,12 +3798,15 @@
           <w:ilvl w:val="0"/>
           <w:numId w:val="11"/>
         </w:numPr>
-        <w:rPr>
-          <w:lang w:val="en-US"/>
-        </w:rPr>
-      </w:pPr>
-      <w:r>
-        <w:rPr>
+        <w:jc w:val="both"/>
+        <w:rPr>
+          <w:rFonts w:ascii="Arial" w:hAnsi="Arial" w:cs="Arial"/>
+          <w:lang w:val="en-US"/>
+        </w:rPr>
+      </w:pPr>
+      <w:r>
+        <w:rPr>
+          <w:rFonts w:ascii="Arial" w:hAnsi="Arial" w:cs="Arial"/>
           <w:b/>
           <w:bCs/>
           <w:lang w:val="en-US"/>
@@ -3565,6 +3815,7 @@
       </w:r>
       <w:r>
         <w:rPr>
+          <w:rFonts w:ascii="Arial" w:hAnsi="Arial" w:cs="Arial"/>
           <w:lang w:val="en-US"/>
         </w:rPr>
         <w:t xml:space="preserve"> "Smart endpoints, dumb pipes." Cross-functional product domains own their integrations from end-to-end, utilizing self-service infrastructure (e.g., an API Gateway configured via declarative CI/CD pipelines) and standard libraries.</w:t>
@@ -3572,14 +3823,17 @@
     </w:p>
     <w:p>
       <w:pPr>
-        <w:rPr>
-          <w:b/>
-          <w:bCs/>
-          <w:lang w:val="en-US"/>
-        </w:rPr>
-      </w:pPr>
-      <w:r>
-        <w:rPr>
+        <w:jc w:val="both"/>
+        <w:rPr>
+          <w:rFonts w:ascii="Arial" w:hAnsi="Arial" w:cs="Arial"/>
+          <w:b/>
+          <w:bCs/>
+          <w:lang w:val="en-US"/>
+        </w:rPr>
+      </w:pPr>
+      <w:r>
+        <w:rPr>
+          <w:rFonts w:ascii="Arial" w:hAnsi="Arial" w:cs="Arial"/>
           <w:b/>
           <w:bCs/>
           <w:lang w:val="en-US"/>
@@ -3589,12 +3843,15 @@
     </w:p>
     <w:p>
       <w:pPr>
-        <w:rPr>
-          <w:lang w:val="en-US"/>
-        </w:rPr>
-      </w:pPr>
-      <w:r>
-        <w:rPr>
+        <w:jc w:val="both"/>
+        <w:rPr>
+          <w:rFonts w:ascii="Arial" w:hAnsi="Arial" w:cs="Arial"/>
+          <w:lang w:val="en-US"/>
+        </w:rPr>
+      </w:pPr>
+      <w:r>
+        <w:rPr>
+          <w:rFonts w:ascii="Arial" w:hAnsi="Arial" w:cs="Arial"/>
           <w:b/>
           <w:bCs/>
           <w:lang w:val="en-US"/>
@@ -3603,13 +3860,23 @@
       </w:r>
       <w:r>
         <w:rPr>
+          <w:rFonts w:ascii="Arial" w:hAnsi="Arial" w:cs="Arial"/>
           <w:lang w:val="en-US"/>
         </w:rPr>
         <w:t xml:space="preserve"> Product teams will build and maintain their own integration microservices. To prevent chaos, a central Platform Engineering team will provide standardized templates (scaffolding), self-service CI/CD tools, and enforce strict API governance (contracts, security policies, and observability standards) at the gateway level.</w:t>
       </w:r>
     </w:p>
     <w:p>
-      <w:r>
+      <w:pPr>
+        <w:jc w:val="both"/>
+        <w:rPr>
+          <w:rFonts w:ascii="Arial" w:hAnsi="Arial" w:cs="Arial"/>
+        </w:rPr>
+      </w:pPr>
+      <w:r>
+        <w:rPr>
+          <w:rFonts w:ascii="Arial" w:hAnsi="Arial" w:cs="Arial"/>
+        </w:rPr>
         <w:pict w14:anchorId="4E5A67A1">
           <v:rect id="_x0000_i1071" style="width:0;height:1.5pt" o:hralign="center" o:hrstd="t" o:hr="t" fillcolor="#a0a0a0" stroked="f"/>
         </w:pict>
@@ -3617,31 +3884,37 @@
     </w:p>
     <w:p>
       <w:pPr>
-        <w:rPr>
-          <w:b/>
-          <w:bCs/>
-          <w:lang w:val="en-US"/>
-        </w:rPr>
-      </w:pPr>
-      <w:r>
-        <w:rPr>
-          <w:b/>
-          <w:bCs/>
-          <w:lang w:val="en-US"/>
-        </w:rPr>
-        <w:t>3. Decision 2: Architecture for Critical Flows</w:t>
-      </w:r>
-    </w:p>
-    <w:p>
-      <w:pPr>
-        <w:rPr>
-          <w:b/>
-          <w:bCs/>
-          <w:lang w:val="en-US"/>
-        </w:rPr>
-      </w:pPr>
-      <w:r>
-        <w:rPr>
+        <w:jc w:val="both"/>
+        <w:rPr>
+          <w:rFonts w:ascii="Arial" w:hAnsi="Arial" w:cs="Arial"/>
+          <w:b/>
+          <w:bCs/>
+          <w:lang w:val="en-US"/>
+        </w:rPr>
+      </w:pPr>
+      <w:r>
+        <w:rPr>
+          <w:rFonts w:ascii="Arial" w:hAnsi="Arial" w:cs="Arial"/>
+          <w:b/>
+          <w:bCs/>
+          <w:lang w:val="en-US"/>
+        </w:rPr>
+        <w:t xml:space="preserve"> Decision 2: Architecture for Critical Flows</w:t>
+      </w:r>
+    </w:p>
+    <w:p>
+      <w:pPr>
+        <w:jc w:val="both"/>
+        <w:rPr>
+          <w:rFonts w:ascii="Arial" w:hAnsi="Arial" w:cs="Arial"/>
+          <w:b/>
+          <w:bCs/>
+          <w:lang w:val="en-US"/>
+        </w:rPr>
+      </w:pPr>
+      <w:r>
+        <w:rPr>
+          <w:rFonts w:ascii="Arial" w:hAnsi="Arial" w:cs="Arial"/>
           <w:b/>
           <w:bCs/>
           <w:lang w:val="en-US"/>
@@ -3655,9 +3928,14 @@
           <w:ilvl w:val="0"/>
           <w:numId w:val="12"/>
         </w:numPr>
-      </w:pPr>
-      <w:r>
-        <w:rPr>
+        <w:jc w:val="both"/>
+        <w:rPr>
+          <w:rFonts w:ascii="Arial" w:hAnsi="Arial" w:cs="Arial"/>
+        </w:rPr>
+      </w:pPr>
+      <w:r>
+        <w:rPr>
+          <w:rFonts w:ascii="Arial" w:hAnsi="Arial" w:cs="Arial"/>
           <w:b/>
           <w:bCs/>
           <w:lang w:val="en-US"/>
@@ -3667,6 +3945,7 @@
       <w:proofErr w:type="spellStart"/>
       <w:r>
         <w:rPr>
+          <w:rFonts w:ascii="Arial" w:hAnsi="Arial" w:cs="Arial"/>
           <w:b/>
           <w:bCs/>
           <w:lang w:val="en-US"/>
@@ -3676,6 +3955,7 @@
       <w:proofErr w:type="spellEnd"/>
       <w:r>
         <w:rPr>
+          <w:rFonts w:ascii="Arial" w:hAnsi="Arial" w:cs="Arial"/>
           <w:b/>
           <w:bCs/>
           <w:lang w:val="en-US"/>
@@ -3684,43 +3964,71 @@
       </w:r>
       <w:r>
         <w:rPr>
+          <w:rFonts w:ascii="Arial" w:hAnsi="Arial" w:cs="Arial"/>
           <w:lang w:val="en-US"/>
         </w:rPr>
         <w:t xml:space="preserve"> Services call each other directly waiting for a response. </w:t>
       </w:r>
       <w:r>
+        <w:rPr>
+          <w:rFonts w:ascii="Arial" w:hAnsi="Arial" w:cs="Arial"/>
+        </w:rPr>
         <w:t xml:space="preserve">Simple </w:t>
       </w:r>
       <w:proofErr w:type="spellStart"/>
       <w:r>
+        <w:rPr>
+          <w:rFonts w:ascii="Arial" w:hAnsi="Arial" w:cs="Arial"/>
+        </w:rPr>
         <w:t>to</w:t>
       </w:r>
       <w:proofErr w:type="spellEnd"/>
       <w:r>
+        <w:rPr>
+          <w:rFonts w:ascii="Arial" w:hAnsi="Arial" w:cs="Arial"/>
+        </w:rPr>
         <w:t xml:space="preserve"> </w:t>
       </w:r>
       <w:proofErr w:type="spellStart"/>
       <w:r>
+        <w:rPr>
+          <w:rFonts w:ascii="Arial" w:hAnsi="Arial" w:cs="Arial"/>
+        </w:rPr>
         <w:t>reason</w:t>
       </w:r>
       <w:proofErr w:type="spellEnd"/>
       <w:r>
+        <w:rPr>
+          <w:rFonts w:ascii="Arial" w:hAnsi="Arial" w:cs="Arial"/>
+        </w:rPr>
         <w:t xml:space="preserve"> </w:t>
       </w:r>
       <w:proofErr w:type="spellStart"/>
       <w:r>
+        <w:rPr>
+          <w:rFonts w:ascii="Arial" w:hAnsi="Arial" w:cs="Arial"/>
+        </w:rPr>
         <w:t>about</w:t>
       </w:r>
       <w:proofErr w:type="spellEnd"/>
       <w:r>
+        <w:rPr>
+          <w:rFonts w:ascii="Arial" w:hAnsi="Arial" w:cs="Arial"/>
+        </w:rPr>
         <w:t xml:space="preserve">, trace, and </w:t>
       </w:r>
       <w:proofErr w:type="spellStart"/>
       <w:r>
+        <w:rPr>
+          <w:rFonts w:ascii="Arial" w:hAnsi="Arial" w:cs="Arial"/>
+        </w:rPr>
         <w:t>implement</w:t>
       </w:r>
       <w:proofErr w:type="spellEnd"/>
       <w:r>
+        <w:rPr>
+          <w:rFonts w:ascii="Arial" w:hAnsi="Arial" w:cs="Arial"/>
+        </w:rPr>
         <w:t>.</w:t>
       </w:r>
     </w:p>
@@ -3730,12 +4038,15 @@
           <w:ilvl w:val="0"/>
           <w:numId w:val="12"/>
         </w:numPr>
-        <w:rPr>
-          <w:lang w:val="en-US"/>
-        </w:rPr>
-      </w:pPr>
-      <w:r>
-        <w:rPr>
+        <w:jc w:val="both"/>
+        <w:rPr>
+          <w:rFonts w:ascii="Arial" w:hAnsi="Arial" w:cs="Arial"/>
+          <w:lang w:val="en-US"/>
+        </w:rPr>
+      </w:pPr>
+      <w:r>
+        <w:rPr>
+          <w:rFonts w:ascii="Arial" w:hAnsi="Arial" w:cs="Arial"/>
           <w:b/>
           <w:bCs/>
           <w:lang w:val="en-US"/>
@@ -3744,6 +4055,7 @@
       </w:r>
       <w:r>
         <w:rPr>
+          <w:rFonts w:ascii="Arial" w:hAnsi="Arial" w:cs="Arial"/>
           <w:lang w:val="en-US"/>
         </w:rPr>
         <w:t xml:space="preserve"> Services communicate by producing and consuming events via an event broker (e.g., Kafka). Services react to state changes without knowing about each other.</w:t>
@@ -3751,29 +4063,36 @@
     </w:p>
     <w:p>
       <w:pPr>
-        <w:rPr>
-          <w:b/>
-          <w:bCs/>
-          <w:lang w:val="en-US"/>
-        </w:rPr>
-      </w:pPr>
-      <w:r>
-        <w:rPr>
-          <w:b/>
-          <w:bCs/>
-          <w:lang w:val="en-US"/>
-        </w:rPr>
+        <w:jc w:val="both"/>
+        <w:rPr>
+          <w:rFonts w:ascii="Arial" w:hAnsi="Arial" w:cs="Arial"/>
+          <w:b/>
+          <w:bCs/>
+          <w:lang w:val="en-US"/>
+        </w:rPr>
+      </w:pPr>
+      <w:r>
+        <w:rPr>
+          <w:rFonts w:ascii="Arial" w:hAnsi="Arial" w:cs="Arial"/>
+          <w:b/>
+          <w:bCs/>
+          <w:lang w:val="en-US"/>
+        </w:rPr>
+        <w:lastRenderedPageBreak/>
         <w:t>Decision</w:t>
       </w:r>
     </w:p>
     <w:p>
       <w:pPr>
-        <w:rPr>
-          <w:lang w:val="en-US"/>
-        </w:rPr>
-      </w:pPr>
-      <w:r>
-        <w:rPr>
+        <w:jc w:val="both"/>
+        <w:rPr>
+          <w:rFonts w:ascii="Arial" w:hAnsi="Arial" w:cs="Arial"/>
+          <w:lang w:val="en-US"/>
+        </w:rPr>
+      </w:pPr>
+      <w:r>
+        <w:rPr>
+          <w:rFonts w:ascii="Arial" w:hAnsi="Arial" w:cs="Arial"/>
           <w:b/>
           <w:bCs/>
           <w:lang w:val="en-US"/>
@@ -3782,13 +4101,23 @@
       </w:r>
       <w:r>
         <w:rPr>
+          <w:rFonts w:ascii="Arial" w:hAnsi="Arial" w:cs="Arial"/>
           <w:lang w:val="en-US"/>
         </w:rPr>
         <w:t xml:space="preserve"> while retaining Synchronous API calls strictly for edge/client queries (Reads) and UI orchestration. Critical writes (e.g., Checkout, Inventory Reservation) will emit domain events.</w:t>
       </w:r>
     </w:p>
     <w:p>
-      <w:r>
+      <w:pPr>
+        <w:jc w:val="both"/>
+        <w:rPr>
+          <w:rFonts w:ascii="Arial" w:hAnsi="Arial" w:cs="Arial"/>
+        </w:rPr>
+      </w:pPr>
+      <w:r>
+        <w:rPr>
+          <w:rFonts w:ascii="Arial" w:hAnsi="Arial" w:cs="Arial"/>
+        </w:rPr>
         <w:pict w14:anchorId="7D465A16">
           <v:rect id="_x0000_i1072" style="width:0;height:1.5pt" o:hralign="center" o:hrstd="t" o:hr="t" fillcolor="#a0a0a0" stroked="f"/>
         </w:pict>
@@ -3796,45 +4125,51 @@
     </w:p>
     <w:p>
       <w:pPr>
-        <w:rPr>
-          <w:b/>
-          <w:bCs/>
-        </w:rPr>
-      </w:pPr>
-      <w:r>
-        <w:rPr>
-          <w:b/>
-          <w:bCs/>
-        </w:rPr>
-        <w:t xml:space="preserve">4. </w:t>
+        <w:jc w:val="both"/>
+        <w:rPr>
+          <w:rFonts w:ascii="Arial" w:hAnsi="Arial" w:cs="Arial"/>
+          <w:b/>
+          <w:bCs/>
+        </w:rPr>
+      </w:pPr>
+      <w:r>
+        <w:rPr>
+          <w:rFonts w:ascii="Arial" w:hAnsi="Arial" w:cs="Arial"/>
+          <w:b/>
+          <w:bCs/>
+        </w:rPr>
+        <w:t xml:space="preserve"> </w:t>
+      </w:r>
+      <w:r>
+        <w:rPr>
+          <w:rFonts w:ascii="Arial" w:hAnsi="Arial" w:cs="Arial"/>
+          <w:b/>
+          <w:bCs/>
+        </w:rPr>
+        <w:t>Consecuentes</w:t>
+      </w:r>
+    </w:p>
+    <w:p>
+      <w:pPr>
+        <w:jc w:val="both"/>
+        <w:rPr>
+          <w:rFonts w:ascii="Arial" w:hAnsi="Arial" w:cs="Arial"/>
+          <w:b/>
+          <w:bCs/>
+        </w:rPr>
+      </w:pPr>
+      <w:r>
+        <w:rPr>
+          <w:rFonts w:ascii="Arial" w:hAnsi="Arial" w:cs="Arial"/>
+          <w:b/>
+          <w:bCs/>
+        </w:rPr>
+        <w:t xml:space="preserve">Positive </w:t>
       </w:r>
       <w:proofErr w:type="spellStart"/>
       <w:r>
         <w:rPr>
-          <w:b/>
-          <w:bCs/>
-        </w:rPr>
-        <w:t>Consequences</w:t>
-      </w:r>
-      <w:proofErr w:type="spellEnd"/>
-    </w:p>
-    <w:p>
-      <w:pPr>
-        <w:rPr>
-          <w:b/>
-          <w:bCs/>
-        </w:rPr>
-      </w:pPr>
-      <w:r>
-        <w:rPr>
-          <w:b/>
-          <w:bCs/>
-        </w:rPr>
-        <w:t xml:space="preserve">Positive </w:t>
-      </w:r>
-      <w:proofErr w:type="spellStart"/>
-      <w:r>
-        <w:rPr>
+          <w:rFonts w:ascii="Arial" w:hAnsi="Arial" w:cs="Arial"/>
           <w:b/>
           <w:bCs/>
         </w:rPr>
@@ -3848,21 +4183,24 @@
           <w:ilvl w:val="0"/>
           <w:numId w:val="13"/>
         </w:numPr>
-        <w:rPr>
-          <w:lang w:val="en-US"/>
-        </w:rPr>
-      </w:pPr>
-      <w:r>
-        <w:rPr>
-          <w:b/>
-          <w:bCs/>
-          <w:lang w:val="en-US"/>
-        </w:rPr>
-        <w:lastRenderedPageBreak/>
+        <w:jc w:val="both"/>
+        <w:rPr>
+          <w:rFonts w:ascii="Arial" w:hAnsi="Arial" w:cs="Arial"/>
+          <w:lang w:val="en-US"/>
+        </w:rPr>
+      </w:pPr>
+      <w:r>
+        <w:rPr>
+          <w:rFonts w:ascii="Arial" w:hAnsi="Arial" w:cs="Arial"/>
+          <w:b/>
+          <w:bCs/>
+          <w:lang w:val="en-US"/>
+        </w:rPr>
         <w:t>Autonomy and Velocity:</w:t>
       </w:r>
       <w:r>
         <w:rPr>
+          <w:rFonts w:ascii="Arial" w:hAnsi="Arial" w:cs="Arial"/>
           <w:lang w:val="en-US"/>
         </w:rPr>
         <w:t xml:space="preserve"> Domain teams are no longer blocked by a centralized integration team's backlog, drastically reducing time-to-market for new regional rollouts.</w:t>
@@ -3874,12 +4212,15 @@
           <w:ilvl w:val="0"/>
           <w:numId w:val="13"/>
         </w:numPr>
-        <w:rPr>
-          <w:lang w:val="en-US"/>
-        </w:rPr>
-      </w:pPr>
-      <w:r>
-        <w:rPr>
+        <w:jc w:val="both"/>
+        <w:rPr>
+          <w:rFonts w:ascii="Arial" w:hAnsi="Arial" w:cs="Arial"/>
+          <w:lang w:val="en-US"/>
+        </w:rPr>
+      </w:pPr>
+      <w:r>
+        <w:rPr>
+          <w:rFonts w:ascii="Arial" w:hAnsi="Arial" w:cs="Arial"/>
           <w:b/>
           <w:bCs/>
           <w:lang w:val="en-US"/>
@@ -3888,6 +4229,7 @@
       </w:r>
       <w:r>
         <w:rPr>
+          <w:rFonts w:ascii="Arial" w:hAnsi="Arial" w:cs="Arial"/>
           <w:lang w:val="en-US"/>
         </w:rPr>
         <w:t xml:space="preserve"> In an event-driven model, if the Notification or Receipt service goes down, the Order service remains unaffected. Messages queue in the broker and process once the downstream service recovers.</w:t>
@@ -3899,12 +4241,15 @@
           <w:ilvl w:val="0"/>
           <w:numId w:val="13"/>
         </w:numPr>
-        <w:rPr>
-          <w:lang w:val="en-US"/>
-        </w:rPr>
-      </w:pPr>
-      <w:r>
-        <w:rPr>
+        <w:jc w:val="both"/>
+        <w:rPr>
+          <w:rFonts w:ascii="Arial" w:hAnsi="Arial" w:cs="Arial"/>
+          <w:lang w:val="en-US"/>
+        </w:rPr>
+      </w:pPr>
+      <w:r>
+        <w:rPr>
+          <w:rFonts w:ascii="Arial" w:hAnsi="Arial" w:cs="Arial"/>
           <w:b/>
           <w:bCs/>
           <w:lang w:val="en-US"/>
@@ -3913,6 +4258,7 @@
       </w:r>
       <w:r>
         <w:rPr>
+          <w:rFonts w:ascii="Arial" w:hAnsi="Arial" w:cs="Arial"/>
           <w:lang w:val="en-US"/>
         </w:rPr>
         <w:t xml:space="preserve"> We can scale specific consumers of an event independently based on load, rather than scaling an entire centralized monolith.</w:t>
@@ -3920,13 +4266,16 @@
     </w:p>
     <w:p>
       <w:pPr>
-        <w:rPr>
-          <w:b/>
-          <w:bCs/>
-        </w:rPr>
-      </w:pPr>
-      <w:r>
-        <w:rPr>
+        <w:jc w:val="both"/>
+        <w:rPr>
+          <w:rFonts w:ascii="Arial" w:hAnsi="Arial" w:cs="Arial"/>
+          <w:b/>
+          <w:bCs/>
+        </w:rPr>
+      </w:pPr>
+      <w:r>
+        <w:rPr>
+          <w:rFonts w:ascii="Arial" w:hAnsi="Arial" w:cs="Arial"/>
           <w:b/>
           <w:bCs/>
         </w:rPr>
@@ -3935,6 +4284,7 @@
       <w:proofErr w:type="spellStart"/>
       <w:r>
         <w:rPr>
+          <w:rFonts w:ascii="Arial" w:hAnsi="Arial" w:cs="Arial"/>
           <w:b/>
           <w:bCs/>
         </w:rPr>
@@ -3943,6 +4293,7 @@
       <w:proofErr w:type="spellEnd"/>
       <w:r>
         <w:rPr>
+          <w:rFonts w:ascii="Arial" w:hAnsi="Arial" w:cs="Arial"/>
           <w:b/>
           <w:bCs/>
         </w:rPr>
@@ -3951,6 +4302,7 @@
       <w:proofErr w:type="spellStart"/>
       <w:r>
         <w:rPr>
+          <w:rFonts w:ascii="Arial" w:hAnsi="Arial" w:cs="Arial"/>
           <w:b/>
           <w:bCs/>
         </w:rPr>
@@ -3959,6 +4311,7 @@
       <w:proofErr w:type="spellEnd"/>
       <w:r>
         <w:rPr>
+          <w:rFonts w:ascii="Arial" w:hAnsi="Arial" w:cs="Arial"/>
           <w:b/>
           <w:bCs/>
         </w:rPr>
@@ -3967,6 +4320,7 @@
       <w:proofErr w:type="spellStart"/>
       <w:r>
         <w:rPr>
+          <w:rFonts w:ascii="Arial" w:hAnsi="Arial" w:cs="Arial"/>
           <w:b/>
           <w:bCs/>
         </w:rPr>
@@ -3975,6 +4329,7 @@
       <w:proofErr w:type="spellEnd"/>
       <w:r>
         <w:rPr>
+          <w:rFonts w:ascii="Arial" w:hAnsi="Arial" w:cs="Arial"/>
           <w:b/>
           <w:bCs/>
         </w:rPr>
@@ -3983,6 +4338,7 @@
       <w:proofErr w:type="spellStart"/>
       <w:r>
         <w:rPr>
+          <w:rFonts w:ascii="Arial" w:hAnsi="Arial" w:cs="Arial"/>
           <w:b/>
           <w:bCs/>
         </w:rPr>
@@ -3996,12 +4352,15 @@
           <w:ilvl w:val="0"/>
           <w:numId w:val="14"/>
         </w:numPr>
-        <w:rPr>
-          <w:lang w:val="en-US"/>
-        </w:rPr>
-      </w:pPr>
-      <w:r>
-        <w:rPr>
+        <w:jc w:val="both"/>
+        <w:rPr>
+          <w:rFonts w:ascii="Arial" w:hAnsi="Arial" w:cs="Arial"/>
+          <w:lang w:val="en-US"/>
+        </w:rPr>
+      </w:pPr>
+      <w:r>
+        <w:rPr>
+          <w:rFonts w:ascii="Arial" w:hAnsi="Arial" w:cs="Arial"/>
           <w:b/>
           <w:bCs/>
           <w:lang w:val="en-US"/>
@@ -4010,6 +4369,7 @@
       </w:r>
       <w:r>
         <w:rPr>
+          <w:rFonts w:ascii="Arial" w:hAnsi="Arial" w:cs="Arial"/>
           <w:lang w:val="en-US"/>
         </w:rPr>
         <w:t xml:space="preserve"> Decentralization and event-driven architectures introduce heavy distributed complexity. We must heavily invest in </w:t>
@@ -4017,6 +4377,7 @@
       <w:proofErr w:type="spellStart"/>
       <w:r>
         <w:rPr>
+          <w:rFonts w:ascii="Arial" w:hAnsi="Arial" w:cs="Arial"/>
           <w:lang w:val="en-US"/>
         </w:rPr>
         <w:t>OpenTelemetry</w:t>
@@ -4024,6 +4385,7 @@
       <w:proofErr w:type="spellEnd"/>
       <w:r>
         <w:rPr>
+          <w:rFonts w:ascii="Arial" w:hAnsi="Arial" w:cs="Arial"/>
           <w:lang w:val="en-US"/>
         </w:rPr>
         <w:t xml:space="preserve"> (Distributed Tracing) and centralized logging to debug flows that span multiple asynchronous boundaries.</w:t>
@@ -4035,12 +4397,15 @@
           <w:ilvl w:val="0"/>
           <w:numId w:val="14"/>
         </w:numPr>
-        <w:rPr>
-          <w:lang w:val="en-US"/>
-        </w:rPr>
-      </w:pPr>
-      <w:r>
-        <w:rPr>
+        <w:jc w:val="both"/>
+        <w:rPr>
+          <w:rFonts w:ascii="Arial" w:hAnsi="Arial" w:cs="Arial"/>
+          <w:lang w:val="en-US"/>
+        </w:rPr>
+      </w:pPr>
+      <w:r>
+        <w:rPr>
+          <w:rFonts w:ascii="Arial" w:hAnsi="Arial" w:cs="Arial"/>
           <w:b/>
           <w:bCs/>
           <w:lang w:val="en-US"/>
@@ -4049,6 +4414,7 @@
       </w:r>
       <w:r>
         <w:rPr>
+          <w:rFonts w:ascii="Arial" w:hAnsi="Arial" w:cs="Arial"/>
           <w:lang w:val="en-US"/>
         </w:rPr>
         <w:t xml:space="preserve"> UI/UX paradigms must shift. Frontends can no longer expect an immediate "success" response for complex flows; they must handle pending states (e.g., </w:t>
@@ -4056,6 +4422,7 @@
       <w:proofErr w:type="spellStart"/>
       <w:r>
         <w:rPr>
+          <w:rFonts w:ascii="Arial" w:hAnsi="Arial" w:cs="Arial"/>
           <w:lang w:val="en-US"/>
         </w:rPr>
         <w:t>WebSockets</w:t>
@@ -4063,6 +4430,7 @@
       <w:proofErr w:type="spellEnd"/>
       <w:r>
         <w:rPr>
+          <w:rFonts w:ascii="Arial" w:hAnsi="Arial" w:cs="Arial"/>
           <w:lang w:val="en-US"/>
         </w:rPr>
         <w:t>, polling, or optimistic UI updates).</w:t>
@@ -4074,12 +4442,15 @@
           <w:ilvl w:val="0"/>
           <w:numId w:val="14"/>
         </w:numPr>
-        <w:rPr>
-          <w:lang w:val="en-US"/>
-        </w:rPr>
-      </w:pPr>
-      <w:r>
-        <w:rPr>
+        <w:jc w:val="both"/>
+        <w:rPr>
+          <w:rFonts w:ascii="Arial" w:hAnsi="Arial" w:cs="Arial"/>
+          <w:lang w:val="en-US"/>
+        </w:rPr>
+      </w:pPr>
+      <w:r>
+        <w:rPr>
+          <w:rFonts w:ascii="Arial" w:hAnsi="Arial" w:cs="Arial"/>
           <w:b/>
           <w:bCs/>
           <w:lang w:val="en-US"/>
@@ -4088,38 +4459,18 @@
       </w:r>
       <w:r>
         <w:rPr>
-          <w:lang w:val="en-US"/>
-        </w:rPr>
-        <w:t xml:space="preserve"> Domain teams must be upskilled in handling asynchronous patterns, idempotency, dead-letter queues, and schema evolution (e.g., Avro/</w:t>
-      </w:r>
-      <w:proofErr w:type="spellStart"/>
-      <w:r>
-        <w:rPr>
-          <w:lang w:val="en-US"/>
-        </w:rPr>
-        <w:t>Protobuf</w:t>
-      </w:r>
-      <w:proofErr w:type="spellEnd"/>
-      <w:r>
-        <w:rPr>
-          <w:lang w:val="en-US"/>
-        </w:rPr>
-        <w:t xml:space="preserve"> registries).</w:t>
-      </w:r>
-    </w:p>
-    <w:p>
-      <w:pPr>
-        <w:rPr>
-          <w:lang w:val="en-US"/>
-        </w:rPr>
-      </w:pPr>
-    </w:p>
-    <w:p>
-      <w:pPr>
-        <w:rPr>
-          <w:lang w:val="en-US"/>
-        </w:rPr>
-      </w:pPr>
+          <w:rFonts w:ascii="Arial" w:hAnsi="Arial" w:cs="Arial"/>
+          <w:lang w:val="en-US"/>
+        </w:rPr>
+        <w:t xml:space="preserve"> Domain teams must be upskilled in handling asynchronous patterns, idempotency, dead-letter queues, and schema evolution</w:t>
+      </w:r>
+      <w:r>
+        <w:rPr>
+          <w:rFonts w:ascii="Arial" w:hAnsi="Arial" w:cs="Arial"/>
+          <w:lang w:val="en-US"/>
+        </w:rPr>
+        <w:t>.</w:t>
+      </w:r>
     </w:p>
     <w:sectPr>
       <w:pgSz w:w="12240" w:h="15840"/>

</xml_diff>